<commit_message>
added pdf versions of product lean business cases
</commit_message>
<xml_diff>
--- a/docs/2_Value_Creation/2b_Demand/Articles/Accelerating Success in the Age of AI/1 Growing Value Exponentially DRAFT.docx
+++ b/docs/2_Value_Creation/2b_Demand/Articles/Accelerating Success in the Age of AI/1 Growing Value Exponentially DRAFT.docx
@@ -35,11 +35,20 @@
     </w:p>
     <w:p>
       <w:r>
+        <w:rPr>
+          <w:noProof/>
+        </w:rPr>
         <w:drawing>
           <wp:inline distT="0" distB="0" distL="0" distR="0" wp14:anchorId="7AEEA789" wp14:editId="00D15DFD">
             <wp:extent cx="5943600" cy="1294765"/>
             <wp:effectExtent l="0" t="0" r="0" b="635"/>
-            <wp:docPr id="1104583806" name="Picture 1"/>
+            <wp:docPr id="1104583806" name="Picture 1">
+              <a:extLst xmlns:a="http://schemas.openxmlformats.org/drawingml/2006/main">
+                <a:ext uri="{FF2B5EF4-FFF2-40B4-BE49-F238E27FC236}">
+                  <a16:creationId xmlns:a16="http://schemas.microsoft.com/office/drawing/2014/main" id="{AB1768EA-12C6-4084-BA68-ECCBF07C54DF}"/>
+                </a:ext>
+              </a:extLst>
+            </wp:docPr>
             <wp:cNvGraphicFramePr>
               <a:graphicFrameLocks xmlns:a="http://schemas.openxmlformats.org/drawingml/2006/main" noChangeAspect="1"/>
             </wp:cNvGraphicFramePr>

</xml_diff>

<commit_message>
Updated draft articles and made redactions
</commit_message>
<xml_diff>
--- a/docs/2_Value_Creation/2b_Demand/Articles/Accelerating Success in the Age of AI/1 Growing Value Exponentially DRAFT.docx
+++ b/docs/2_Value_Creation/2b_Demand/Articles/Accelerating Success in the Age of AI/1 Growing Value Exponentially DRAFT.docx
@@ -39,16 +39,10 @@
           <w:noProof/>
         </w:rPr>
         <w:drawing>
-          <wp:inline distT="0" distB="0" distL="0" distR="0" wp14:anchorId="7AEEA789" wp14:editId="00D15DFD">
-            <wp:extent cx="5943600" cy="1294765"/>
-            <wp:effectExtent l="0" t="0" r="0" b="635"/>
-            <wp:docPr id="1104583806" name="Picture 1">
-              <a:extLst xmlns:a="http://schemas.openxmlformats.org/drawingml/2006/main">
-                <a:ext uri="{FF2B5EF4-FFF2-40B4-BE49-F238E27FC236}">
-                  <a16:creationId xmlns:a16="http://schemas.microsoft.com/office/drawing/2014/main" id="{AB1768EA-12C6-4084-BA68-ECCBF07C54DF}"/>
-                </a:ext>
-              </a:extLst>
-            </wp:docPr>
+          <wp:inline distT="0" distB="0" distL="0" distR="0" wp14:anchorId="31170650" wp14:editId="00D243C4">
+            <wp:extent cx="5943600" cy="2312035"/>
+            <wp:effectExtent l="0" t="0" r="0" b="0"/>
+            <wp:docPr id="963276381" name="Picture 1"/>
             <wp:cNvGraphicFramePr>
               <a:graphicFrameLocks xmlns:a="http://schemas.openxmlformats.org/drawingml/2006/main" noChangeAspect="1"/>
             </wp:cNvGraphicFramePr>
@@ -56,11 +50,17 @@
               <a:graphicData uri="http://schemas.openxmlformats.org/drawingml/2006/picture">
                 <pic:pic xmlns:pic="http://schemas.openxmlformats.org/drawingml/2006/picture">
                   <pic:nvPicPr>
-                    <pic:cNvPr id="1104583806" name=""/>
+                    <pic:cNvPr id="963276381" name="Picture 963276381"/>
                     <pic:cNvPicPr/>
                   </pic:nvPicPr>
                   <pic:blipFill>
-                    <a:blip r:embed="rId6"/>
+                    <a:blip r:embed="rId6" cstate="print">
+                      <a:extLst>
+                        <a:ext uri="{28A0092B-C50C-407E-A947-70E740481C1C}">
+                          <a14:useLocalDpi xmlns:a14="http://schemas.microsoft.com/office/drawing/2010/main" val="0"/>
+                        </a:ext>
+                      </a:extLst>
+                    </a:blip>
                     <a:stretch>
                       <a:fillRect/>
                     </a:stretch>
@@ -68,7 +68,7 @@
                   <pic:spPr>
                     <a:xfrm>
                       <a:off x="0" y="0"/>
-                      <a:ext cx="5943600" cy="1294765"/>
+                      <a:ext cx="5943600" cy="2312035"/>
                     </a:xfrm>
                     <a:prstGeom prst="rect">
                       <a:avLst/>

</xml_diff>

<commit_message>
Added Editorial Calendar to Demand Generation Dashboard and added new article "Grow the Value of your Data - Exponentially DRAFT.docx" to the Articles folder.
</commit_message>
<xml_diff>
--- a/docs/2_Value_Creation/2b_Demand/Articles/Accelerating Success in the Age of AI/1 Growing Value Exponentially DRAFT.docx
+++ b/docs/2_Value_Creation/2b_Demand/Articles/Accelerating Success in the Age of AI/1 Growing Value Exponentially DRAFT.docx
@@ -1,13 +1,823 @@
 
 <file path=word/document.xml><?xml version="1.0" encoding="utf-8"?>
-<w:document xmlns:wpc="http://schemas.microsoft.com/office/word/2010/wordprocessingCanvas" xmlns:cx="http://schemas.microsoft.com/office/drawing/2014/chartex" xmlns:cx1="http://schemas.microsoft.com/office/drawing/2015/9/8/chartex" xmlns:cx2="http://schemas.microsoft.com/office/drawing/2015/10/21/chartex" xmlns:cx3="http://schemas.microsoft.com/office/drawing/2016/5/9/chartex" xmlns:cx4="http://schemas.microsoft.com/office/drawing/2016/5/10/chartex" xmlns:cx5="http://schemas.microsoft.com/office/drawing/2016/5/11/chartex" xmlns:cx6="http://schemas.microsoft.com/office/drawing/2016/5/12/chartex" xmlns:cx7="http://schemas.microsoft.com/office/drawing/2016/5/13/chartex" xmlns:cx8="http://schemas.microsoft.com/office/drawing/2016/5/14/chartex" xmlns:mc="http://schemas.openxmlformats.org/markup-compatibility/2006" xmlns:aink="http://schemas.microsoft.com/office/drawing/2016/ink" xmlns:am3d="http://schemas.microsoft.com/office/drawing/2017/model3d" xmlns:o="urn:schemas-microsoft-com:office:office" xmlns:oel="http://schemas.microsoft.com/office/2019/extlst" xmlns:r="http://schemas.openxmlformats.org/officeDocument/2006/relationships" xmlns:m="http://schemas.openxmlformats.org/officeDocument/2006/math" xmlns:v="urn:schemas-microsoft-com:vml" xmlns:wp14="http://schemas.microsoft.com/office/word/2010/wordprocessingDrawing" xmlns:wp="http://schemas.openxmlformats.org/drawingml/2006/wordprocessingDrawing" xmlns:w10="urn:schemas-microsoft-com:office:word" xmlns:w="http://schemas.openxmlformats.org/wordprocessingml/2006/main" xmlns:w14="http://schemas.microsoft.com/office/word/2010/wordml" xmlns:w15="http://schemas.microsoft.com/office/word/2012/wordml" xmlns:w16cex="http://schemas.microsoft.com/office/word/2018/wordml/cex" xmlns:w16cid="http://schemas.microsoft.com/office/word/2016/wordml/cid" xmlns:w16="http://schemas.microsoft.com/office/word/2018/wordml" xmlns:w16du="http://schemas.microsoft.com/office/word/2023/wordml/word16du" xmlns:w16sdtdh="http://schemas.microsoft.com/office/word/2020/wordml/sdtdatahash" xmlns:w16sdtfl="http://schemas.microsoft.com/office/word/2024/wordml/sdtformatlock" xmlns:w16se="http://schemas.microsoft.com/office/word/2015/wordml/symex" xmlns:wpg="http://schemas.microsoft.com/office/word/2010/wordprocessingGroup" xmlns:wpi="http://schemas.microsoft.com/office/word/2010/wordprocessingInk" xmlns:wne="http://schemas.microsoft.com/office/word/2006/wordml" xmlns:wps="http://schemas.microsoft.com/office/word/2010/wordprocessingShape" mc:Ignorable="w14 w15 w16se w16cid w16 w16cex w16sdtdh w16sdtfl w16du wp14">
+<w:document xmlns:wpc="http://schemas.microsoft.com/office/word/2010/wordprocessingCanvas" xmlns:cx="http://schemas.microsoft.com/office/drawing/2014/chartex" xmlns:cx1="http://schemas.microsoft.com/office/drawing/2015/9/8/chartex" xmlns:cx2="http://schemas.microsoft.com/office/drawing/2015/10/21/chartex" xmlns:cx3="http://schemas.microsoft.com/office/drawing/2016/5/9/chartex" xmlns:cx4="http://schemas.microsoft.com/office/drawing/2016/5/10/chartex" xmlns:cx5="http://schemas.microsoft.com/office/drawing/2016/5/11/chartex" xmlns:cx6="http://schemas.microsoft.com/office/drawing/2016/5/12/chartex" xmlns:cx7="http://schemas.microsoft.com/office/drawing/2016/5/13/chartex" xmlns:cx8="http://schemas.microsoft.com/office/drawing/2016/5/14/chartex" xmlns:mc="http://schemas.openxmlformats.org/markup-compatibility/2006" xmlns:m="http://schemas.openxmlformats.org/officeDocument/2006/math" xmlns:aink="http://schemas.microsoft.com/office/drawing/2016/ink" xmlns:am3d="http://schemas.microsoft.com/office/drawing/2017/model3d" xmlns:oel="http://schemas.microsoft.com/office/2019/extlst" xmlns:r="http://schemas.openxmlformats.org/officeDocument/2006/relationships" xmlns:wp14="http://schemas.microsoft.com/office/word/2010/wordprocessingDrawing" xmlns:wp="http://schemas.openxmlformats.org/drawingml/2006/wordprocessingDrawing" xmlns:wpg="http://schemas.microsoft.com/office/word/2010/wordprocessingGroup" xmlns:wpi="http://schemas.microsoft.com/office/word/2010/wordprocessingInk" xmlns:wps="http://schemas.microsoft.com/office/word/2010/wordprocessingShape" xmlns:o="urn:schemas-microsoft-com:office:office" xmlns:v="urn:schemas-microsoft-com:vml" xmlns:w10="urn:schemas-microsoft-com:office:word" xmlns:w="http://schemas.openxmlformats.org/wordprocessingml/2006/main" xmlns:w14="http://schemas.microsoft.com/office/word/2010/wordml" xmlns:w15="http://schemas.microsoft.com/office/word/2012/wordml" xmlns:w16cex="http://schemas.microsoft.com/office/word/2018/wordml/cex" xmlns:w16cid="http://schemas.microsoft.com/office/word/2016/wordml/cid" xmlns:w16="http://schemas.microsoft.com/office/word/2018/wordml" xmlns:w16sdtdh="http://schemas.microsoft.com/office/word/2020/wordml/sdtdatahash" xmlns:w16sdtfl="http://schemas.microsoft.com/office/word/2024/wordml/sdtformatlock" xmlns:w16se="http://schemas.microsoft.com/office/word/2015/wordml/symex" xmlns:w16du="http://schemas.microsoft.com/office/word/2023/wordml/word16du" xmlns:wne="http://schemas.microsoft.com/office/word/2006/wordml" mc:Ignorable="w14 w15 w16se w16cid w16 w16cex w16sdtdh w16sdtfl w16du wp14">
   <w:body>
+    <w:sdt>
+      <w:sdtPr>
+        <w:id w:val="-1680108940"/>
+        <w:docPartObj>
+          <w:docPartGallery w:val="Table of Contents"/>
+          <w:docPartUnique/>
+        </w:docPartObj>
+      </w:sdtPr>
+      <w:sdtEndPr>
+        <w:rPr>
+          <w:rFonts w:asciiTheme="minorHAnsi" w:eastAsiaTheme="minorHAnsi" w:hAnsiTheme="minorHAnsi" w:cstheme="minorBidi"/>
+          <w:noProof/>
+          <w:color w:val="auto"/>
+          <w:kern w:val="2"/>
+          <w:sz w:val="24"/>
+          <w:szCs w:val="24"/>
+          <w14:ligatures w14:val="standardContextual"/>
+        </w:rPr>
+      </w:sdtEndPr>
+      <w:sdtContent>
+        <w:p>
+          <w:pPr>
+            <w:pStyle w:val="TOCHeading"/>
+          </w:pPr>
+          <w:r>
+            <w:t>Table of Contents</w:t>
+          </w:r>
+        </w:p>
+        <w:p>
+          <w:pPr>
+            <w:pStyle w:val="TOC1"/>
+            <w:tabs>
+              <w:tab w:val="right" w:leader="dot" w:pos="9350"/>
+            </w:tabs>
+            <w:rPr>
+              <w:rFonts w:eastAsiaTheme="minorEastAsia" w:cstheme="minorBidi"/>
+              <w:b w:val="0"/>
+              <w:bCs w:val="0"/>
+              <w:i w:val="0"/>
+              <w:iCs w:val="0"/>
+              <w:noProof/>
+            </w:rPr>
+          </w:pPr>
+          <w:r>
+            <w:rPr>
+              <w:b w:val="0"/>
+              <w:bCs w:val="0"/>
+            </w:rPr>
+            <w:fldChar w:fldCharType="begin"/>
+          </w:r>
+          <w:r>
+            <w:instrText xml:space="preserve"> TOC \o "1-3" \h \z \u </w:instrText>
+          </w:r>
+          <w:r>
+            <w:rPr>
+              <w:b w:val="0"/>
+              <w:bCs w:val="0"/>
+            </w:rPr>
+            <w:fldChar w:fldCharType="separate"/>
+          </w:r>
+          <w:hyperlink w:anchor="_Toc239602748" w:history="1">
+            <w:r>
+              <w:rPr>
+                <w:rStyle w:val="Hyperlink"/>
+                <w:noProof/>
+              </w:rPr>
+              <w:t>Theme</w:t>
+            </w:r>
+            <w:r>
+              <w:rPr>
+                <w:noProof/>
+                <w:webHidden/>
+              </w:rPr>
+              <w:tab/>
+            </w:r>
+            <w:r>
+              <w:rPr>
+                <w:noProof/>
+                <w:webHidden/>
+              </w:rPr>
+              <w:fldChar w:fldCharType="begin"/>
+            </w:r>
+            <w:r>
+              <w:rPr>
+                <w:noProof/>
+                <w:webHidden/>
+              </w:rPr>
+              <w:instrText xml:space="preserve"> PAGEREF _Toc239602748 \h </w:instrText>
+            </w:r>
+            <w:r>
+              <w:rPr>
+                <w:noProof/>
+                <w:webHidden/>
+              </w:rPr>
+            </w:r>
+            <w:r>
+              <w:rPr>
+                <w:noProof/>
+                <w:webHidden/>
+              </w:rPr>
+              <w:fldChar w:fldCharType="separate"/>
+            </w:r>
+            <w:r>
+              <w:rPr>
+                <w:noProof/>
+                <w:webHidden/>
+              </w:rPr>
+              <w:t>2</w:t>
+            </w:r>
+            <w:r>
+              <w:rPr>
+                <w:noProof/>
+                <w:webHidden/>
+              </w:rPr>
+              <w:fldChar w:fldCharType="end"/>
+            </w:r>
+          </w:hyperlink>
+        </w:p>
+        <w:p>
+          <w:pPr>
+            <w:pStyle w:val="TOC1"/>
+            <w:tabs>
+              <w:tab w:val="right" w:leader="dot" w:pos="9350"/>
+            </w:tabs>
+            <w:rPr>
+              <w:rFonts w:eastAsiaTheme="minorEastAsia" w:cstheme="minorBidi"/>
+              <w:b w:val="0"/>
+              <w:bCs w:val="0"/>
+              <w:i w:val="0"/>
+              <w:iCs w:val="0"/>
+              <w:noProof/>
+            </w:rPr>
+          </w:pPr>
+          <w:hyperlink w:anchor="_Toc239602749" w:history="1">
+            <w:r>
+              <w:rPr>
+                <w:rStyle w:val="Hyperlink"/>
+                <w:noProof/>
+              </w:rPr>
+              <w:t>Objective</w:t>
+            </w:r>
+            <w:r>
+              <w:rPr>
+                <w:noProof/>
+                <w:webHidden/>
+              </w:rPr>
+              <w:tab/>
+            </w:r>
+            <w:r>
+              <w:rPr>
+                <w:noProof/>
+                <w:webHidden/>
+              </w:rPr>
+              <w:fldChar w:fldCharType="begin"/>
+            </w:r>
+            <w:r>
+              <w:rPr>
+                <w:noProof/>
+                <w:webHidden/>
+              </w:rPr>
+              <w:instrText xml:space="preserve"> PAGEREF _Toc239602749 \h </w:instrText>
+            </w:r>
+            <w:r>
+              <w:rPr>
+                <w:noProof/>
+                <w:webHidden/>
+              </w:rPr>
+            </w:r>
+            <w:r>
+              <w:rPr>
+                <w:noProof/>
+                <w:webHidden/>
+              </w:rPr>
+              <w:fldChar w:fldCharType="separate"/>
+            </w:r>
+            <w:r>
+              <w:rPr>
+                <w:noProof/>
+                <w:webHidden/>
+              </w:rPr>
+              <w:t>2</w:t>
+            </w:r>
+            <w:r>
+              <w:rPr>
+                <w:noProof/>
+                <w:webHidden/>
+              </w:rPr>
+              <w:fldChar w:fldCharType="end"/>
+            </w:r>
+          </w:hyperlink>
+        </w:p>
+        <w:p>
+          <w:pPr>
+            <w:pStyle w:val="TOC1"/>
+            <w:tabs>
+              <w:tab w:val="right" w:leader="dot" w:pos="9350"/>
+            </w:tabs>
+            <w:rPr>
+              <w:rFonts w:eastAsiaTheme="minorEastAsia" w:cstheme="minorBidi"/>
+              <w:b w:val="0"/>
+              <w:bCs w:val="0"/>
+              <w:i w:val="0"/>
+              <w:iCs w:val="0"/>
+              <w:noProof/>
+            </w:rPr>
+          </w:pPr>
+          <w:hyperlink w:anchor="_Toc239602750" w:history="1">
+            <w:r>
+              <w:rPr>
+                <w:rStyle w:val="Hyperlink"/>
+                <w:noProof/>
+              </w:rPr>
+              <w:t>Related Topics</w:t>
+            </w:r>
+            <w:r>
+              <w:rPr>
+                <w:noProof/>
+                <w:webHidden/>
+              </w:rPr>
+              <w:tab/>
+            </w:r>
+            <w:r>
+              <w:rPr>
+                <w:noProof/>
+                <w:webHidden/>
+              </w:rPr>
+              <w:fldChar w:fldCharType="begin"/>
+            </w:r>
+            <w:r>
+              <w:rPr>
+                <w:noProof/>
+                <w:webHidden/>
+              </w:rPr>
+              <w:instrText xml:space="preserve"> PAGEREF _Toc239602750 \h </w:instrText>
+            </w:r>
+            <w:r>
+              <w:rPr>
+                <w:noProof/>
+                <w:webHidden/>
+              </w:rPr>
+            </w:r>
+            <w:r>
+              <w:rPr>
+                <w:noProof/>
+                <w:webHidden/>
+              </w:rPr>
+              <w:fldChar w:fldCharType="separate"/>
+            </w:r>
+            <w:r>
+              <w:rPr>
+                <w:noProof/>
+                <w:webHidden/>
+              </w:rPr>
+              <w:t>2</w:t>
+            </w:r>
+            <w:r>
+              <w:rPr>
+                <w:noProof/>
+                <w:webHidden/>
+              </w:rPr>
+              <w:fldChar w:fldCharType="end"/>
+            </w:r>
+          </w:hyperlink>
+        </w:p>
+        <w:p>
+          <w:pPr>
+            <w:pStyle w:val="TOC2"/>
+            <w:tabs>
+              <w:tab w:val="right" w:leader="dot" w:pos="9350"/>
+            </w:tabs>
+            <w:rPr>
+              <w:rFonts w:eastAsiaTheme="minorEastAsia" w:cstheme="minorBidi"/>
+              <w:b w:val="0"/>
+              <w:bCs w:val="0"/>
+              <w:noProof/>
+              <w:sz w:val="24"/>
+              <w:szCs w:val="24"/>
+            </w:rPr>
+          </w:pPr>
+          <w:hyperlink w:anchor="_Toc239602751" w:history="1">
+            <w:r>
+              <w:rPr>
+                <w:rStyle w:val="Hyperlink"/>
+                <w:noProof/>
+              </w:rPr>
+              <w:t>Guidance for our Board of Directors</w:t>
+            </w:r>
+            <w:r>
+              <w:rPr>
+                <w:noProof/>
+                <w:webHidden/>
+              </w:rPr>
+              <w:tab/>
+            </w:r>
+            <w:r>
+              <w:rPr>
+                <w:noProof/>
+                <w:webHidden/>
+              </w:rPr>
+              <w:fldChar w:fldCharType="begin"/>
+            </w:r>
+            <w:r>
+              <w:rPr>
+                <w:noProof/>
+                <w:webHidden/>
+              </w:rPr>
+              <w:instrText xml:space="preserve"> PAGEREF _Toc239602751 \h </w:instrText>
+            </w:r>
+            <w:r>
+              <w:rPr>
+                <w:noProof/>
+                <w:webHidden/>
+              </w:rPr>
+            </w:r>
+            <w:r>
+              <w:rPr>
+                <w:noProof/>
+                <w:webHidden/>
+              </w:rPr>
+              <w:fldChar w:fldCharType="separate"/>
+            </w:r>
+            <w:r>
+              <w:rPr>
+                <w:noProof/>
+                <w:webHidden/>
+              </w:rPr>
+              <w:t>2</w:t>
+            </w:r>
+            <w:r>
+              <w:rPr>
+                <w:noProof/>
+                <w:webHidden/>
+              </w:rPr>
+              <w:fldChar w:fldCharType="end"/>
+            </w:r>
+          </w:hyperlink>
+        </w:p>
+        <w:p>
+          <w:pPr>
+            <w:pStyle w:val="TOC2"/>
+            <w:tabs>
+              <w:tab w:val="right" w:leader="dot" w:pos="9350"/>
+            </w:tabs>
+            <w:rPr>
+              <w:rFonts w:eastAsiaTheme="minorEastAsia" w:cstheme="minorBidi"/>
+              <w:b w:val="0"/>
+              <w:bCs w:val="0"/>
+              <w:noProof/>
+              <w:sz w:val="24"/>
+              <w:szCs w:val="24"/>
+            </w:rPr>
+          </w:pPr>
+          <w:hyperlink w:anchor="_Toc239602752" w:history="1">
+            <w:r>
+              <w:rPr>
+                <w:rStyle w:val="Hyperlink"/>
+                <w:noProof/>
+              </w:rPr>
+              <w:t>Our Consortium’s Cumulative Logic</w:t>
+            </w:r>
+            <w:r>
+              <w:rPr>
+                <w:noProof/>
+                <w:webHidden/>
+              </w:rPr>
+              <w:tab/>
+            </w:r>
+            <w:r>
+              <w:rPr>
+                <w:noProof/>
+                <w:webHidden/>
+              </w:rPr>
+              <w:fldChar w:fldCharType="begin"/>
+            </w:r>
+            <w:r>
+              <w:rPr>
+                <w:noProof/>
+                <w:webHidden/>
+              </w:rPr>
+              <w:instrText xml:space="preserve"> PAGEREF _Toc239602752 \h </w:instrText>
+            </w:r>
+            <w:r>
+              <w:rPr>
+                <w:noProof/>
+                <w:webHidden/>
+              </w:rPr>
+            </w:r>
+            <w:r>
+              <w:rPr>
+                <w:noProof/>
+                <w:webHidden/>
+              </w:rPr>
+              <w:fldChar w:fldCharType="separate"/>
+            </w:r>
+            <w:r>
+              <w:rPr>
+                <w:noProof/>
+                <w:webHidden/>
+              </w:rPr>
+              <w:t>3</w:t>
+            </w:r>
+            <w:r>
+              <w:rPr>
+                <w:noProof/>
+                <w:webHidden/>
+              </w:rPr>
+              <w:fldChar w:fldCharType="end"/>
+            </w:r>
+          </w:hyperlink>
+        </w:p>
+        <w:p>
+          <w:pPr>
+            <w:pStyle w:val="TOC2"/>
+            <w:tabs>
+              <w:tab w:val="right" w:leader="dot" w:pos="9350"/>
+            </w:tabs>
+            <w:rPr>
+              <w:rFonts w:eastAsiaTheme="minorEastAsia" w:cstheme="minorBidi"/>
+              <w:b w:val="0"/>
+              <w:bCs w:val="0"/>
+              <w:noProof/>
+              <w:sz w:val="24"/>
+              <w:szCs w:val="24"/>
+            </w:rPr>
+          </w:pPr>
+          <w:hyperlink w:anchor="_Toc239602753" w:history="1">
+            <w:r>
+              <w:rPr>
+                <w:rStyle w:val="Hyperlink"/>
+                <w:noProof/>
+              </w:rPr>
+              <w:t>Our 3-Horizon Strategy</w:t>
+            </w:r>
+            <w:r>
+              <w:rPr>
+                <w:noProof/>
+                <w:webHidden/>
+              </w:rPr>
+              <w:tab/>
+            </w:r>
+            <w:r>
+              <w:rPr>
+                <w:noProof/>
+                <w:webHidden/>
+              </w:rPr>
+              <w:fldChar w:fldCharType="begin"/>
+            </w:r>
+            <w:r>
+              <w:rPr>
+                <w:noProof/>
+                <w:webHidden/>
+              </w:rPr>
+              <w:instrText xml:space="preserve"> PAGEREF _Toc239602753 \h </w:instrText>
+            </w:r>
+            <w:r>
+              <w:rPr>
+                <w:noProof/>
+                <w:webHidden/>
+              </w:rPr>
+            </w:r>
+            <w:r>
+              <w:rPr>
+                <w:noProof/>
+                <w:webHidden/>
+              </w:rPr>
+              <w:fldChar w:fldCharType="separate"/>
+            </w:r>
+            <w:r>
+              <w:rPr>
+                <w:noProof/>
+                <w:webHidden/>
+              </w:rPr>
+              <w:t>3</w:t>
+            </w:r>
+            <w:r>
+              <w:rPr>
+                <w:noProof/>
+                <w:webHidden/>
+              </w:rPr>
+              <w:fldChar w:fldCharType="end"/>
+            </w:r>
+          </w:hyperlink>
+        </w:p>
+        <w:p>
+          <w:pPr>
+            <w:pStyle w:val="TOC2"/>
+            <w:tabs>
+              <w:tab w:val="right" w:leader="dot" w:pos="9350"/>
+            </w:tabs>
+            <w:rPr>
+              <w:rFonts w:eastAsiaTheme="minorEastAsia" w:cstheme="minorBidi"/>
+              <w:b w:val="0"/>
+              <w:bCs w:val="0"/>
+              <w:noProof/>
+              <w:sz w:val="24"/>
+              <w:szCs w:val="24"/>
+            </w:rPr>
+          </w:pPr>
+          <w:hyperlink w:anchor="_Toc239602754" w:history="1">
+            <w:r>
+              <w:rPr>
+                <w:rStyle w:val="Hyperlink"/>
+                <w:noProof/>
+              </w:rPr>
+              <w:t>Relevant AccelRR8 Framework Stories</w:t>
+            </w:r>
+            <w:r>
+              <w:rPr>
+                <w:noProof/>
+                <w:webHidden/>
+              </w:rPr>
+              <w:tab/>
+            </w:r>
+            <w:r>
+              <w:rPr>
+                <w:noProof/>
+                <w:webHidden/>
+              </w:rPr>
+              <w:fldChar w:fldCharType="begin"/>
+            </w:r>
+            <w:r>
+              <w:rPr>
+                <w:noProof/>
+                <w:webHidden/>
+              </w:rPr>
+              <w:instrText xml:space="preserve"> PAGEREF _Toc239602754 \h </w:instrText>
+            </w:r>
+            <w:r>
+              <w:rPr>
+                <w:noProof/>
+                <w:webHidden/>
+              </w:rPr>
+            </w:r>
+            <w:r>
+              <w:rPr>
+                <w:noProof/>
+                <w:webHidden/>
+              </w:rPr>
+              <w:fldChar w:fldCharType="separate"/>
+            </w:r>
+            <w:r>
+              <w:rPr>
+                <w:noProof/>
+                <w:webHidden/>
+              </w:rPr>
+              <w:t>4</w:t>
+            </w:r>
+            <w:r>
+              <w:rPr>
+                <w:noProof/>
+                <w:webHidden/>
+              </w:rPr>
+              <w:fldChar w:fldCharType="end"/>
+            </w:r>
+          </w:hyperlink>
+        </w:p>
+        <w:p>
+          <w:pPr>
+            <w:pStyle w:val="TOC1"/>
+            <w:tabs>
+              <w:tab w:val="right" w:leader="dot" w:pos="9350"/>
+            </w:tabs>
+            <w:rPr>
+              <w:rFonts w:eastAsiaTheme="minorEastAsia" w:cstheme="minorBidi"/>
+              <w:b w:val="0"/>
+              <w:bCs w:val="0"/>
+              <w:i w:val="0"/>
+              <w:iCs w:val="0"/>
+              <w:noProof/>
+            </w:rPr>
+          </w:pPr>
+          <w:hyperlink w:anchor="_Toc239602755" w:history="1">
+            <w:r>
+              <w:rPr>
+                <w:rStyle w:val="Hyperlink"/>
+                <w:noProof/>
+              </w:rPr>
+              <w:t>Ideas</w:t>
+            </w:r>
+            <w:r>
+              <w:rPr>
+                <w:noProof/>
+                <w:webHidden/>
+              </w:rPr>
+              <w:tab/>
+            </w:r>
+            <w:r>
+              <w:rPr>
+                <w:noProof/>
+                <w:webHidden/>
+              </w:rPr>
+              <w:fldChar w:fldCharType="begin"/>
+            </w:r>
+            <w:r>
+              <w:rPr>
+                <w:noProof/>
+                <w:webHidden/>
+              </w:rPr>
+              <w:instrText xml:space="preserve"> PAGEREF _Toc239602755 \h </w:instrText>
+            </w:r>
+            <w:r>
+              <w:rPr>
+                <w:noProof/>
+                <w:webHidden/>
+              </w:rPr>
+            </w:r>
+            <w:r>
+              <w:rPr>
+                <w:noProof/>
+                <w:webHidden/>
+              </w:rPr>
+              <w:fldChar w:fldCharType="separate"/>
+            </w:r>
+            <w:r>
+              <w:rPr>
+                <w:noProof/>
+                <w:webHidden/>
+              </w:rPr>
+              <w:t>5</w:t>
+            </w:r>
+            <w:r>
+              <w:rPr>
+                <w:noProof/>
+                <w:webHidden/>
+              </w:rPr>
+              <w:fldChar w:fldCharType="end"/>
+            </w:r>
+          </w:hyperlink>
+        </w:p>
+        <w:p>
+          <w:pPr>
+            <w:pStyle w:val="TOC1"/>
+            <w:tabs>
+              <w:tab w:val="right" w:leader="dot" w:pos="9350"/>
+            </w:tabs>
+            <w:rPr>
+              <w:rFonts w:eastAsiaTheme="minorEastAsia" w:cstheme="minorBidi"/>
+              <w:b w:val="0"/>
+              <w:bCs w:val="0"/>
+              <w:i w:val="0"/>
+              <w:iCs w:val="0"/>
+              <w:noProof/>
+            </w:rPr>
+          </w:pPr>
+          <w:hyperlink w:anchor="_Toc239602756" w:history="1">
+            <w:r>
+              <w:rPr>
+                <w:rStyle w:val="Hyperlink"/>
+                <w:noProof/>
+              </w:rPr>
+              <w:t>Outline</w:t>
+            </w:r>
+            <w:r>
+              <w:rPr>
+                <w:noProof/>
+                <w:webHidden/>
+              </w:rPr>
+              <w:tab/>
+            </w:r>
+            <w:r>
+              <w:rPr>
+                <w:noProof/>
+                <w:webHidden/>
+              </w:rPr>
+              <w:fldChar w:fldCharType="begin"/>
+            </w:r>
+            <w:r>
+              <w:rPr>
+                <w:noProof/>
+                <w:webHidden/>
+              </w:rPr>
+              <w:instrText xml:space="preserve"> PAGEREF _Toc239602756 \h </w:instrText>
+            </w:r>
+            <w:r>
+              <w:rPr>
+                <w:noProof/>
+                <w:webHidden/>
+              </w:rPr>
+            </w:r>
+            <w:r>
+              <w:rPr>
+                <w:noProof/>
+                <w:webHidden/>
+              </w:rPr>
+              <w:fldChar w:fldCharType="separate"/>
+            </w:r>
+            <w:r>
+              <w:rPr>
+                <w:noProof/>
+                <w:webHidden/>
+              </w:rPr>
+              <w:t>7</w:t>
+            </w:r>
+            <w:r>
+              <w:rPr>
+                <w:noProof/>
+                <w:webHidden/>
+              </w:rPr>
+              <w:fldChar w:fldCharType="end"/>
+            </w:r>
+          </w:hyperlink>
+        </w:p>
+        <w:p>
+          <w:pPr>
+            <w:pStyle w:val="TOC1"/>
+            <w:tabs>
+              <w:tab w:val="right" w:leader="dot" w:pos="9350"/>
+            </w:tabs>
+            <w:rPr>
+              <w:rFonts w:eastAsiaTheme="minorEastAsia" w:cstheme="minorBidi"/>
+              <w:b w:val="0"/>
+              <w:bCs w:val="0"/>
+              <w:i w:val="0"/>
+              <w:iCs w:val="0"/>
+              <w:noProof/>
+            </w:rPr>
+          </w:pPr>
+          <w:hyperlink w:anchor="_Toc239602757" w:history="1">
+            <w:r>
+              <w:rPr>
+                <w:rStyle w:val="Hyperlink"/>
+                <w:noProof/>
+              </w:rPr>
+              <w:t>Draft</w:t>
+            </w:r>
+            <w:r>
+              <w:rPr>
+                <w:noProof/>
+                <w:webHidden/>
+              </w:rPr>
+              <w:tab/>
+            </w:r>
+            <w:r>
+              <w:rPr>
+                <w:noProof/>
+                <w:webHidden/>
+              </w:rPr>
+              <w:fldChar w:fldCharType="begin"/>
+            </w:r>
+            <w:r>
+              <w:rPr>
+                <w:noProof/>
+                <w:webHidden/>
+              </w:rPr>
+              <w:instrText xml:space="preserve"> PAGEREF _Toc239602757 \h </w:instrText>
+            </w:r>
+            <w:r>
+              <w:rPr>
+                <w:noProof/>
+                <w:webHidden/>
+              </w:rPr>
+            </w:r>
+            <w:r>
+              <w:rPr>
+                <w:noProof/>
+                <w:webHidden/>
+              </w:rPr>
+              <w:fldChar w:fldCharType="separate"/>
+            </w:r>
+            <w:r>
+              <w:rPr>
+                <w:noProof/>
+                <w:webHidden/>
+              </w:rPr>
+              <w:t>8</w:t>
+            </w:r>
+            <w:r>
+              <w:rPr>
+                <w:noProof/>
+                <w:webHidden/>
+              </w:rPr>
+              <w:fldChar w:fldCharType="end"/>
+            </w:r>
+          </w:hyperlink>
+        </w:p>
+        <w:p>
+          <w:r>
+            <w:rPr>
+              <w:b/>
+              <w:bCs/>
+              <w:noProof/>
+            </w:rPr>
+            <w:fldChar w:fldCharType="end"/>
+          </w:r>
+        </w:p>
+      </w:sdtContent>
+    </w:sdt>
+    <w:p>
+      <w:pPr>
+        <w:rPr>
+          <w:rFonts w:asciiTheme="majorHAnsi" w:eastAsiaTheme="majorEastAsia" w:hAnsiTheme="majorHAnsi" w:cstheme="majorBidi"/>
+          <w:color w:val="2F5496" w:themeColor="accent1" w:themeShade="BF"/>
+          <w:sz w:val="40"/>
+          <w:szCs w:val="40"/>
+        </w:rPr>
+      </w:pPr>
+      <w:r>
+        <w:br w:type="page"/>
+      </w:r>
+    </w:p>
     <w:p>
       <w:pPr>
         <w:pStyle w:val="Heading1"/>
       </w:pPr>
-      <w:r>
-        <w:t xml:space="preserve">Theme </w:t>
+    </w:p>
+    <w:p>
+      <w:pPr>
+        <w:pStyle w:val="Heading1"/>
+      </w:pPr>
+      <w:bookmarkStart w:id="0" w:name="_Toc239602748"/>
+      <w:r>
+        <w:t>Theme</w:t>
+      </w:r>
+      <w:bookmarkEnd w:id="0"/>
+      <w:r>
+        <w:t xml:space="preserve"> </w:t>
       </w:r>
     </w:p>
     <w:p>
@@ -24,14 +834,101 @@
       <w:r>
         <w:t xml:space="preserve"> accelerate success in the age of AI</w:t>
       </w:r>
+      <w:r>
+        <w:br/>
+      </w:r>
     </w:p>
     <w:p>
       <w:pPr>
         <w:pStyle w:val="Heading1"/>
       </w:pPr>
+      <w:bookmarkStart w:id="1" w:name="_Toc239602749"/>
+      <w:r>
+        <w:t>Objective</w:t>
+      </w:r>
+      <w:bookmarkEnd w:id="1"/>
+    </w:p>
+    <w:p>
+      <w:r>
+        <w:t>Publish a</w:t>
+      </w:r>
+      <w:r>
+        <w:t xml:space="preserve"> compelling value proposition </w:t>
+      </w:r>
+      <w:r>
+        <w:t xml:space="preserve">that </w:t>
+      </w:r>
+      <w:r>
+        <w:t>i</w:t>
+      </w:r>
+      <w:r>
+        <w:t>nspire</w:t>
+      </w:r>
+      <w:r>
+        <w:t>s</w:t>
+      </w:r>
+      <w:r>
+        <w:t xml:space="preserve"> enterprising leaders to become Consortium Subscribers and engage with our network, services, and content</w:t>
+      </w:r>
+      <w:r>
+        <w:t>, addressing</w:t>
+      </w:r>
+      <w:r>
+        <w:t>:</w:t>
+      </w:r>
+      <w:r>
+        <w:br/>
+        <w:t xml:space="preserve">- </w:t>
+      </w:r>
+      <w:r>
+        <w:t>how enterprising leaders can succeed in the age of AI</w:t>
+      </w:r>
+      <w:r>
+        <w:t xml:space="preserve"> by growing value exponentially</w:t>
+      </w:r>
+      <w:r>
+        <w:t xml:space="preserve">, and </w:t>
+      </w:r>
+      <w:r>
+        <w:br/>
+        <w:t xml:space="preserve">- </w:t>
+      </w:r>
+      <w:r>
+        <w:t xml:space="preserve">how </w:t>
+      </w:r>
+      <w:r>
+        <w:t>our</w:t>
+      </w:r>
+      <w:r>
+        <w:t xml:space="preserve"> C</w:t>
+      </w:r>
+      <w:r>
+        <w:t>onsortium can help</w:t>
+      </w:r>
+      <w:r>
+        <w:t xml:space="preserve"> them</w:t>
+      </w:r>
+    </w:p>
+    <w:p/>
+    <w:p>
+      <w:pPr>
+        <w:pStyle w:val="Heading1"/>
+      </w:pPr>
+      <w:bookmarkStart w:id="2" w:name="_Toc239602750"/>
       <w:r>
         <w:t>Related Topics</w:t>
       </w:r>
+      <w:bookmarkEnd w:id="2"/>
+    </w:p>
+    <w:p>
+      <w:pPr>
+        <w:pStyle w:val="Heading2"/>
+      </w:pPr>
+      <w:bookmarkStart w:id="3" w:name="_Toc239602751"/>
+      <w:r>
+        <w:t>Guidance for our Board of Directors</w:t>
+      </w:r>
+      <w:bookmarkEnd w:id="3"/>
     </w:p>
     <w:p>
       <w:r>
@@ -54,7 +951,7 @@
                     <pic:cNvPicPr/>
                   </pic:nvPicPr>
                   <pic:blipFill>
-                    <a:blip r:embed="rId6" cstate="print">
+                    <a:blip r:embed="rId8" cstate="print">
                       <a:extLst>
                         <a:ext uri="{28A0092B-C50C-407E-A947-70E740481C1C}">
                           <a14:useLocalDpi xmlns:a14="http://schemas.microsoft.com/office/drawing/2010/main" val="0"/>
@@ -83,23 +980,1978 @@
     </w:p>
     <w:p>
       <w:pPr>
+        <w:rPr>
+          <w:b/>
+          <w:bCs/>
+        </w:rPr>
+      </w:pPr>
+    </w:p>
+    <w:p>
+      <w:pPr>
+        <w:pStyle w:val="Heading2"/>
+      </w:pPr>
+      <w:r>
+        <w:lastRenderedPageBreak/>
+        <w:br/>
+      </w:r>
+      <w:bookmarkStart w:id="4" w:name="_Toc239602752"/>
+      <w:r>
+        <w:t>Our Consortium’s Cumulative Logic</w:t>
+      </w:r>
+      <w:bookmarkEnd w:id="4"/>
+    </w:p>
+    <w:p>
+      <w:pPr>
+        <w:rPr>
+          <w:b/>
+          <w:bCs/>
+        </w:rPr>
+      </w:pPr>
+      <w:r>
+        <w:rPr>
+          <w:b/>
+          <w:bCs/>
+          <w:noProof/>
+        </w:rPr>
+        <w:drawing>
+          <wp:inline distT="0" distB="0" distL="0" distR="0" wp14:anchorId="0B1C9C33" wp14:editId="70FE104D">
+            <wp:extent cx="5943600" cy="2579370"/>
+            <wp:effectExtent l="0" t="0" r="0" b="0"/>
+            <wp:docPr id="743337917" name="Picture 1"/>
+            <wp:cNvGraphicFramePr>
+              <a:graphicFrameLocks xmlns:a="http://schemas.openxmlformats.org/drawingml/2006/main" noChangeAspect="1"/>
+            </wp:cNvGraphicFramePr>
+            <a:graphic xmlns:a="http://schemas.openxmlformats.org/drawingml/2006/main">
+              <a:graphicData uri="http://schemas.openxmlformats.org/drawingml/2006/picture">
+                <pic:pic xmlns:pic="http://schemas.openxmlformats.org/drawingml/2006/picture">
+                  <pic:nvPicPr>
+                    <pic:cNvPr id="743337917" name="Picture 743337917"/>
+                    <pic:cNvPicPr/>
+                  </pic:nvPicPr>
+                  <pic:blipFill>
+                    <a:blip r:embed="rId9" cstate="print">
+                      <a:extLst>
+                        <a:ext uri="{28A0092B-C50C-407E-A947-70E740481C1C}">
+                          <a14:useLocalDpi xmlns:a14="http://schemas.microsoft.com/office/drawing/2010/main" val="0"/>
+                        </a:ext>
+                      </a:extLst>
+                    </a:blip>
+                    <a:stretch>
+                      <a:fillRect/>
+                    </a:stretch>
+                  </pic:blipFill>
+                  <pic:spPr>
+                    <a:xfrm>
+                      <a:off x="0" y="0"/>
+                      <a:ext cx="5943600" cy="2579370"/>
+                    </a:xfrm>
+                    <a:prstGeom prst="rect">
+                      <a:avLst/>
+                    </a:prstGeom>
+                  </pic:spPr>
+                </pic:pic>
+              </a:graphicData>
+            </a:graphic>
+          </wp:inline>
+        </w:drawing>
+      </w:r>
+    </w:p>
+    <w:p>
+      <w:pPr>
+        <w:pStyle w:val="Heading2"/>
+      </w:pPr>
+    </w:p>
+    <w:p>
+      <w:pPr>
+        <w:pStyle w:val="Heading2"/>
+      </w:pPr>
+      <w:bookmarkStart w:id="5" w:name="_Toc239602753"/>
+      <w:r>
+        <w:t>Our 3-Horizon Strategy</w:t>
+      </w:r>
+      <w:bookmarkEnd w:id="5"/>
+    </w:p>
+    <w:p>
+      <w:r>
+        <w:rPr>
+          <w:noProof/>
+        </w:rPr>
+        <w:drawing>
+          <wp:inline distT="0" distB="0" distL="0" distR="0" wp14:anchorId="2CA1CDB2" wp14:editId="4AD0C7F6">
+            <wp:extent cx="5943600" cy="3343275"/>
+            <wp:effectExtent l="0" t="0" r="0" b="0"/>
+            <wp:docPr id="142138560" name="Picture 2"/>
+            <wp:cNvGraphicFramePr>
+              <a:graphicFrameLocks xmlns:a="http://schemas.openxmlformats.org/drawingml/2006/main" noChangeAspect="1"/>
+            </wp:cNvGraphicFramePr>
+            <a:graphic xmlns:a="http://schemas.openxmlformats.org/drawingml/2006/main">
+              <a:graphicData uri="http://schemas.openxmlformats.org/drawingml/2006/picture">
+                <pic:pic xmlns:pic="http://schemas.openxmlformats.org/drawingml/2006/picture">
+                  <pic:nvPicPr>
+                    <pic:cNvPr id="142138560" name="Picture 142138560"/>
+                    <pic:cNvPicPr/>
+                  </pic:nvPicPr>
+                  <pic:blipFill>
+                    <a:blip r:embed="rId10">
+                      <a:extLst>
+                        <a:ext uri="{28A0092B-C50C-407E-A947-70E740481C1C}">
+                          <a14:useLocalDpi xmlns:a14="http://schemas.microsoft.com/office/drawing/2010/main" val="0"/>
+                        </a:ext>
+                      </a:extLst>
+                    </a:blip>
+                    <a:stretch>
+                      <a:fillRect/>
+                    </a:stretch>
+                  </pic:blipFill>
+                  <pic:spPr>
+                    <a:xfrm>
+                      <a:off x="0" y="0"/>
+                      <a:ext cx="5943600" cy="3343275"/>
+                    </a:xfrm>
+                    <a:prstGeom prst="rect">
+                      <a:avLst/>
+                    </a:prstGeom>
+                  </pic:spPr>
+                </pic:pic>
+              </a:graphicData>
+            </a:graphic>
+          </wp:inline>
+        </w:drawing>
+      </w:r>
+    </w:p>
+    <w:p/>
+    <w:p>
+      <w:pPr>
+        <w:pStyle w:val="Heading2"/>
+      </w:pPr>
+      <w:r>
+        <w:lastRenderedPageBreak/>
+        <w:br/>
+      </w:r>
+      <w:bookmarkStart w:id="6" w:name="_Toc239602754"/>
+      <w:r>
+        <w:t xml:space="preserve">Relevant </w:t>
+      </w:r>
+      <w:r>
+        <w:t>AccelRR8 Framework Stories</w:t>
+      </w:r>
+      <w:bookmarkEnd w:id="6"/>
+    </w:p>
+    <w:p>
+      <w:pPr>
+        <w:pStyle w:val="ListParagraph"/>
+        <w:numPr>
+          <w:ilvl w:val="0"/>
+          <w:numId w:val="1"/>
+        </w:numPr>
+      </w:pPr>
+      <w:hyperlink r:id="rId11" w:history="1">
+        <w:r>
+          <w:rPr>
+            <w:rStyle w:val="Hyperlink"/>
+          </w:rPr>
+          <w:t>Rocket to Your Aspirations Using the AccelRR8 Framework</w:t>
+        </w:r>
+      </w:hyperlink>
+    </w:p>
+    <w:p>
+      <w:pPr>
+        <w:pStyle w:val="ListParagraph"/>
+        <w:numPr>
+          <w:ilvl w:val="0"/>
+          <w:numId w:val="1"/>
+        </w:numPr>
+      </w:pPr>
+      <w:hyperlink r:id="rId12" w:history="1">
+        <w:r>
+          <w:rPr>
+            <w:rStyle w:val="Hyperlink"/>
+          </w:rPr>
+          <w:t>Using the AccelRR8 Framework to Grow Value Exponentially</w:t>
+        </w:r>
+      </w:hyperlink>
+    </w:p>
+    <w:p>
+      <w:pPr>
+        <w:rPr>
+          <w:rFonts w:asciiTheme="majorHAnsi" w:eastAsiaTheme="majorEastAsia" w:hAnsiTheme="majorHAnsi" w:cstheme="majorBidi"/>
+          <w:color w:val="2F5496" w:themeColor="accent1" w:themeShade="BF"/>
+          <w:sz w:val="40"/>
+          <w:szCs w:val="40"/>
+        </w:rPr>
+      </w:pPr>
+      <w:r>
+        <w:br w:type="page"/>
+      </w:r>
+    </w:p>
+    <w:p>
+      <w:pPr>
         <w:pStyle w:val="Heading1"/>
       </w:pPr>
       <w:r>
+        <w:lastRenderedPageBreak/>
+        <w:br/>
+      </w:r>
+      <w:bookmarkStart w:id="7" w:name="_Toc239602755"/>
+      <w:r>
+        <w:t>Ideas</w:t>
+      </w:r>
+      <w:bookmarkEnd w:id="7"/>
+    </w:p>
+    <w:p/>
+    <w:p>
+      <w:pPr>
+        <w:pStyle w:val="ListParagraph"/>
+        <w:numPr>
+          <w:ilvl w:val="0"/>
+          <w:numId w:val="1"/>
+        </w:numPr>
+        <w:rPr>
+          <w:rFonts w:asciiTheme="majorHAnsi" w:eastAsiaTheme="majorEastAsia" w:hAnsiTheme="majorHAnsi" w:cstheme="majorBidi"/>
+          <w:b/>
+          <w:bCs/>
+          <w:color w:val="2F5496" w:themeColor="accent1" w:themeShade="BF"/>
+        </w:rPr>
+      </w:pPr>
+      <w:r>
+        <w:rPr>
+          <w:b/>
+          <w:bCs/>
+        </w:rPr>
+        <w:t>Many enterprising leaders</w:t>
+      </w:r>
+      <w:r>
+        <w:rPr>
+          <w:b/>
+          <w:bCs/>
+        </w:rPr>
+        <w:t xml:space="preserve"> I know</w:t>
+      </w:r>
+      <w:r>
+        <w:rPr>
+          <w:b/>
+          <w:bCs/>
+        </w:rPr>
+        <w:t xml:space="preserve"> are excited about </w:t>
+      </w:r>
+      <w:r>
+        <w:rPr>
+          <w:b/>
+          <w:bCs/>
+        </w:rPr>
+        <w:t>AI’s potential</w:t>
+      </w:r>
+      <w:r>
+        <w:rPr>
+          <w:b/>
+          <w:bCs/>
+        </w:rPr>
+        <w:t xml:space="preserve"> in the near term</w:t>
+      </w:r>
+      <w:r>
+        <w:rPr>
+          <w:b/>
+          <w:bCs/>
+        </w:rPr>
+        <w:t xml:space="preserve">, </w:t>
+      </w:r>
+      <w:r>
+        <w:rPr>
+          <w:b/>
+          <w:bCs/>
+        </w:rPr>
+        <w:t xml:space="preserve">and </w:t>
+      </w:r>
+      <w:r>
+        <w:rPr>
+          <w:b/>
+          <w:bCs/>
+        </w:rPr>
+        <w:t xml:space="preserve">fearful </w:t>
+      </w:r>
+      <w:r>
+        <w:rPr>
+          <w:b/>
+          <w:bCs/>
+        </w:rPr>
+        <w:t>of</w:t>
+      </w:r>
+      <w:r>
+        <w:rPr>
+          <w:b/>
+          <w:bCs/>
+        </w:rPr>
+        <w:t xml:space="preserve"> </w:t>
+      </w:r>
+      <w:r>
+        <w:rPr>
+          <w:b/>
+          <w:bCs/>
+        </w:rPr>
+        <w:t>it</w:t>
+      </w:r>
+      <w:r>
+        <w:rPr>
+          <w:b/>
+          <w:bCs/>
+        </w:rPr>
+        <w:t>s</w:t>
+      </w:r>
+      <w:r>
+        <w:rPr>
+          <w:b/>
+          <w:bCs/>
+        </w:rPr>
+        <w:t xml:space="preserve"> </w:t>
+      </w:r>
+      <w:r>
+        <w:rPr>
+          <w:b/>
+          <w:bCs/>
+        </w:rPr>
+        <w:t xml:space="preserve">impact </w:t>
+      </w:r>
+      <w:r>
+        <w:rPr>
+          <w:b/>
+          <w:bCs/>
+        </w:rPr>
+        <w:t xml:space="preserve">in the </w:t>
+      </w:r>
+      <w:r>
+        <w:rPr>
+          <w:b/>
+          <w:bCs/>
+        </w:rPr>
+        <w:t>long term</w:t>
+      </w:r>
+      <w:r>
+        <w:rPr>
+          <w:b/>
+          <w:bCs/>
+        </w:rPr>
+        <w:t>.</w:t>
+      </w:r>
+    </w:p>
+    <w:tbl>
+      <w:tblPr>
+        <w:tblStyle w:val="GridTable5Dark-Accent6"/>
+        <w:tblW w:w="0" w:type="auto"/>
+        <w:tblInd w:w="715" w:type="dxa"/>
+        <w:tblLook w:val="04A0" w:firstRow="1" w:lastRow="0" w:firstColumn="1" w:lastColumn="0" w:noHBand="0" w:noVBand="1"/>
+      </w:tblPr>
+      <w:tblGrid>
+        <w:gridCol w:w="1170"/>
+        <w:gridCol w:w="3330"/>
+        <w:gridCol w:w="3780"/>
+      </w:tblGrid>
+      <w:tr>
+        <w:trPr>
+          <w:cnfStyle w:val="100000000000" w:firstRow="1" w:lastRow="0" w:firstColumn="0" w:lastColumn="0" w:oddVBand="0" w:evenVBand="0" w:oddHBand="0" w:evenHBand="0" w:firstRowFirstColumn="0" w:firstRowLastColumn="0" w:lastRowFirstColumn="0" w:lastRowLastColumn="0"/>
+        </w:trPr>
+        <w:tc>
+          <w:tcPr>
+            <w:cnfStyle w:val="001000000000" w:firstRow="0" w:lastRow="0" w:firstColumn="1" w:lastColumn="0" w:oddVBand="0" w:evenVBand="0" w:oddHBand="0" w:evenHBand="0" w:firstRowFirstColumn="0" w:firstRowLastColumn="0" w:lastRowFirstColumn="0" w:lastRowLastColumn="0"/>
+            <w:tcW w:w="1170" w:type="dxa"/>
+            <w:shd w:val="clear" w:color="auto" w:fill="FFFFFF" w:themeFill="background1"/>
+          </w:tcPr>
+          <w:p>
+            <w:pPr>
+              <w:rPr>
+                <w:rFonts w:asciiTheme="majorHAnsi" w:eastAsiaTheme="majorEastAsia" w:hAnsiTheme="majorHAnsi" w:cstheme="majorBidi"/>
+              </w:rPr>
+            </w:pPr>
+          </w:p>
+        </w:tc>
+        <w:tc>
+          <w:tcPr>
+            <w:tcW w:w="3330" w:type="dxa"/>
+            <w:tcBorders>
+              <w:bottom w:val="nil"/>
+            </w:tcBorders>
+            <w:shd w:val="clear" w:color="auto" w:fill="00B050"/>
+          </w:tcPr>
+          <w:p>
+            <w:pPr>
+              <w:cnfStyle w:val="100000000000" w:firstRow="1" w:lastRow="0" w:firstColumn="0" w:lastColumn="0" w:oddVBand="0" w:evenVBand="0" w:oddHBand="0" w:evenHBand="0" w:firstRowFirstColumn="0" w:firstRowLastColumn="0" w:lastRowFirstColumn="0" w:lastRowLastColumn="0"/>
+              <w:rPr>
+                <w:rFonts w:asciiTheme="majorHAnsi" w:eastAsiaTheme="majorEastAsia" w:hAnsiTheme="majorHAnsi" w:cstheme="majorBidi"/>
+              </w:rPr>
+            </w:pPr>
+            <w:r>
+              <w:rPr>
+                <w:rFonts w:asciiTheme="majorHAnsi" w:eastAsiaTheme="majorEastAsia" w:hAnsiTheme="majorHAnsi" w:cstheme="majorBidi"/>
+              </w:rPr>
+              <w:t>Excited</w:t>
+            </w:r>
+          </w:p>
+        </w:tc>
+        <w:tc>
+          <w:tcPr>
+            <w:tcW w:w="3780" w:type="dxa"/>
+            <w:tcBorders>
+              <w:bottom w:val="nil"/>
+            </w:tcBorders>
+            <w:shd w:val="clear" w:color="auto" w:fill="00B050"/>
+          </w:tcPr>
+          <w:p>
+            <w:pPr>
+              <w:cnfStyle w:val="100000000000" w:firstRow="1" w:lastRow="0" w:firstColumn="0" w:lastColumn="0" w:oddVBand="0" w:evenVBand="0" w:oddHBand="0" w:evenHBand="0" w:firstRowFirstColumn="0" w:firstRowLastColumn="0" w:lastRowFirstColumn="0" w:lastRowLastColumn="0"/>
+              <w:rPr>
+                <w:rFonts w:asciiTheme="majorHAnsi" w:eastAsiaTheme="majorEastAsia" w:hAnsiTheme="majorHAnsi" w:cstheme="majorBidi"/>
+              </w:rPr>
+            </w:pPr>
+            <w:r>
+              <w:rPr>
+                <w:rFonts w:asciiTheme="majorHAnsi" w:eastAsiaTheme="majorEastAsia" w:hAnsiTheme="majorHAnsi" w:cstheme="majorBidi"/>
+              </w:rPr>
+              <w:t>Fearful</w:t>
+            </w:r>
+          </w:p>
+        </w:tc>
+      </w:tr>
+      <w:tr>
+        <w:trPr>
+          <w:cnfStyle w:val="000000100000" w:firstRow="0" w:lastRow="0" w:firstColumn="0" w:lastColumn="0" w:oddVBand="0" w:evenVBand="0" w:oddHBand="1" w:evenHBand="0" w:firstRowFirstColumn="0" w:firstRowLastColumn="0" w:lastRowFirstColumn="0" w:lastRowLastColumn="0"/>
+          <w:trHeight w:val="818"/>
+        </w:trPr>
+        <w:tc>
+          <w:tcPr>
+            <w:cnfStyle w:val="001000000000" w:firstRow="0" w:lastRow="0" w:firstColumn="1" w:lastColumn="0" w:oddVBand="0" w:evenVBand="0" w:oddHBand="0" w:evenHBand="0" w:firstRowFirstColumn="0" w:firstRowLastColumn="0" w:lastRowFirstColumn="0" w:lastRowLastColumn="0"/>
+            <w:tcW w:w="1170" w:type="dxa"/>
+            <w:tcBorders>
+              <w:right w:val="nil"/>
+            </w:tcBorders>
+            <w:shd w:val="clear" w:color="auto" w:fill="00B050"/>
+          </w:tcPr>
+          <w:p>
+            <w:pPr>
+              <w:rPr>
+                <w:rFonts w:asciiTheme="majorHAnsi" w:eastAsiaTheme="majorEastAsia" w:hAnsiTheme="majorHAnsi" w:cstheme="majorBidi"/>
+              </w:rPr>
+            </w:pPr>
+            <w:r>
+              <w:rPr>
+                <w:rFonts w:asciiTheme="majorHAnsi" w:eastAsiaTheme="majorEastAsia" w:hAnsiTheme="majorHAnsi" w:cstheme="majorBidi"/>
+              </w:rPr>
+              <w:t xml:space="preserve">My </w:t>
+            </w:r>
+            <w:r>
+              <w:rPr>
+                <w:rFonts w:asciiTheme="majorHAnsi" w:eastAsiaTheme="majorEastAsia" w:hAnsiTheme="majorHAnsi" w:cstheme="majorBidi"/>
+              </w:rPr>
+              <w:br/>
+            </w:r>
+            <w:r>
+              <w:rPr>
+                <w:rFonts w:asciiTheme="majorHAnsi" w:eastAsiaTheme="majorEastAsia" w:hAnsiTheme="majorHAnsi" w:cstheme="majorBidi"/>
+              </w:rPr>
+              <w:t>Job</w:t>
+            </w:r>
+          </w:p>
+        </w:tc>
+        <w:tc>
+          <w:tcPr>
+            <w:tcW w:w="3330" w:type="dxa"/>
+            <w:tcBorders>
+              <w:top w:val="nil"/>
+              <w:left w:val="nil"/>
+              <w:bottom w:val="single" w:sz="4" w:space="0" w:color="BFBFBF" w:themeColor="background1" w:themeShade="BF"/>
+              <w:right w:val="nil"/>
+            </w:tcBorders>
+            <w:shd w:val="clear" w:color="auto" w:fill="FFFFFF" w:themeFill="background1"/>
+          </w:tcPr>
+          <w:p>
+            <w:pPr>
+              <w:cnfStyle w:val="000000100000" w:firstRow="0" w:lastRow="0" w:firstColumn="0" w:lastColumn="0" w:oddVBand="0" w:evenVBand="0" w:oddHBand="1" w:evenHBand="0" w:firstRowFirstColumn="0" w:firstRowLastColumn="0" w:lastRowFirstColumn="0" w:lastRowLastColumn="0"/>
+              <w:rPr>
+                <w:rFonts w:asciiTheme="majorHAnsi" w:eastAsiaTheme="majorEastAsia" w:hAnsiTheme="majorHAnsi" w:cstheme="majorBidi"/>
+                <w:color w:val="000000" w:themeColor="text1"/>
+              </w:rPr>
+            </w:pPr>
+            <w:r>
+              <w:rPr>
+                <w:rFonts w:asciiTheme="majorHAnsi" w:eastAsiaTheme="majorEastAsia" w:hAnsiTheme="majorHAnsi" w:cstheme="majorBidi"/>
+                <w:color w:val="000000" w:themeColor="text1"/>
+              </w:rPr>
+              <w:t xml:space="preserve">How can </w:t>
+            </w:r>
+            <w:r>
+              <w:rPr>
+                <w:rFonts w:asciiTheme="majorHAnsi" w:eastAsiaTheme="majorEastAsia" w:hAnsiTheme="majorHAnsi" w:cstheme="majorBidi"/>
+                <w:color w:val="000000" w:themeColor="text1"/>
+              </w:rPr>
+              <w:t>it</w:t>
+            </w:r>
+            <w:r>
+              <w:rPr>
+                <w:rFonts w:asciiTheme="majorHAnsi" w:eastAsiaTheme="majorEastAsia" w:hAnsiTheme="majorHAnsi" w:cstheme="majorBidi"/>
+                <w:color w:val="000000" w:themeColor="text1"/>
+              </w:rPr>
+              <w:t xml:space="preserve"> help my do my job </w:t>
+            </w:r>
+            <w:r>
+              <w:rPr>
+                <w:rFonts w:asciiTheme="majorHAnsi" w:eastAsiaTheme="majorEastAsia" w:hAnsiTheme="majorHAnsi" w:cstheme="majorBidi"/>
+                <w:color w:val="000000" w:themeColor="text1"/>
+              </w:rPr>
+              <w:t xml:space="preserve">better / </w:t>
+            </w:r>
+            <w:r>
+              <w:rPr>
+                <w:rFonts w:asciiTheme="majorHAnsi" w:eastAsiaTheme="majorEastAsia" w:hAnsiTheme="majorHAnsi" w:cstheme="majorBidi"/>
+                <w:color w:val="000000" w:themeColor="text1"/>
+              </w:rPr>
+              <w:t>grow more value?</w:t>
+            </w:r>
+          </w:p>
+        </w:tc>
+        <w:tc>
+          <w:tcPr>
+            <w:tcW w:w="3780" w:type="dxa"/>
+            <w:tcBorders>
+              <w:top w:val="nil"/>
+              <w:left w:val="nil"/>
+              <w:bottom w:val="single" w:sz="4" w:space="0" w:color="BFBFBF" w:themeColor="background1" w:themeShade="BF"/>
+              <w:right w:val="nil"/>
+            </w:tcBorders>
+            <w:shd w:val="clear" w:color="auto" w:fill="FFFFFF" w:themeFill="background1"/>
+          </w:tcPr>
+          <w:p>
+            <w:pPr>
+              <w:cnfStyle w:val="000000100000" w:firstRow="0" w:lastRow="0" w:firstColumn="0" w:lastColumn="0" w:oddVBand="0" w:evenVBand="0" w:oddHBand="1" w:evenHBand="0" w:firstRowFirstColumn="0" w:firstRowLastColumn="0" w:lastRowFirstColumn="0" w:lastRowLastColumn="0"/>
+              <w:rPr>
+                <w:rFonts w:asciiTheme="majorHAnsi" w:eastAsiaTheme="majorEastAsia" w:hAnsiTheme="majorHAnsi" w:cstheme="majorBidi"/>
+                <w:color w:val="000000" w:themeColor="text1"/>
+              </w:rPr>
+            </w:pPr>
+            <w:r>
+              <w:rPr>
+                <w:rFonts w:asciiTheme="majorHAnsi" w:eastAsiaTheme="majorEastAsia" w:hAnsiTheme="majorHAnsi" w:cstheme="majorBidi"/>
+                <w:color w:val="000000" w:themeColor="text1"/>
+              </w:rPr>
+              <w:t>Will my job still be needed?</w:t>
+            </w:r>
+            <w:r>
+              <w:rPr>
+                <w:rFonts w:asciiTheme="majorHAnsi" w:eastAsiaTheme="majorEastAsia" w:hAnsiTheme="majorHAnsi" w:cstheme="majorBidi"/>
+                <w:color w:val="000000" w:themeColor="text1"/>
+              </w:rPr>
+              <w:br/>
+              <w:t>How does it need to evolve?</w:t>
+            </w:r>
+          </w:p>
+        </w:tc>
+      </w:tr>
+      <w:tr>
+        <w:trPr>
+          <w:trHeight w:val="809"/>
+        </w:trPr>
+        <w:tc>
+          <w:tcPr>
+            <w:cnfStyle w:val="001000000000" w:firstRow="0" w:lastRow="0" w:firstColumn="1" w:lastColumn="0" w:oddVBand="0" w:evenVBand="0" w:oddHBand="0" w:evenHBand="0" w:firstRowFirstColumn="0" w:firstRowLastColumn="0" w:lastRowFirstColumn="0" w:lastRowLastColumn="0"/>
+            <w:tcW w:w="1170" w:type="dxa"/>
+            <w:tcBorders>
+              <w:right w:val="nil"/>
+            </w:tcBorders>
+            <w:shd w:val="clear" w:color="auto" w:fill="00B050"/>
+          </w:tcPr>
+          <w:p>
+            <w:pPr>
+              <w:rPr>
+                <w:rFonts w:asciiTheme="majorHAnsi" w:eastAsiaTheme="majorEastAsia" w:hAnsiTheme="majorHAnsi" w:cstheme="majorBidi"/>
+              </w:rPr>
+            </w:pPr>
+            <w:r>
+              <w:rPr>
+                <w:rFonts w:asciiTheme="majorHAnsi" w:eastAsiaTheme="majorEastAsia" w:hAnsiTheme="majorHAnsi" w:cstheme="majorBidi"/>
+              </w:rPr>
+              <w:t>My Career</w:t>
+            </w:r>
+          </w:p>
+        </w:tc>
+        <w:tc>
+          <w:tcPr>
+            <w:tcW w:w="3330" w:type="dxa"/>
+            <w:tcBorders>
+              <w:top w:val="single" w:sz="4" w:space="0" w:color="BFBFBF" w:themeColor="background1" w:themeShade="BF"/>
+              <w:left w:val="nil"/>
+              <w:bottom w:val="single" w:sz="4" w:space="0" w:color="BFBFBF" w:themeColor="background1" w:themeShade="BF"/>
+              <w:right w:val="nil"/>
+            </w:tcBorders>
+            <w:shd w:val="clear" w:color="auto" w:fill="FFFFFF" w:themeFill="background1"/>
+          </w:tcPr>
+          <w:p>
+            <w:pPr>
+              <w:cnfStyle w:val="000000000000" w:firstRow="0" w:lastRow="0" w:firstColumn="0" w:lastColumn="0" w:oddVBand="0" w:evenVBand="0" w:oddHBand="0" w:evenHBand="0" w:firstRowFirstColumn="0" w:firstRowLastColumn="0" w:lastRowFirstColumn="0" w:lastRowLastColumn="0"/>
+              <w:rPr>
+                <w:rFonts w:asciiTheme="majorHAnsi" w:eastAsiaTheme="majorEastAsia" w:hAnsiTheme="majorHAnsi" w:cstheme="majorBidi"/>
+                <w:color w:val="000000" w:themeColor="text1"/>
+              </w:rPr>
+            </w:pPr>
+            <w:r>
+              <w:rPr>
+                <w:rFonts w:asciiTheme="majorHAnsi" w:eastAsiaTheme="majorEastAsia" w:hAnsiTheme="majorHAnsi" w:cstheme="majorBidi"/>
+                <w:color w:val="000000" w:themeColor="text1"/>
+              </w:rPr>
+              <w:t xml:space="preserve">What doors can it help </w:t>
+            </w:r>
+            <w:r>
+              <w:rPr>
+                <w:rFonts w:asciiTheme="majorHAnsi" w:eastAsiaTheme="majorEastAsia" w:hAnsiTheme="majorHAnsi" w:cstheme="majorBidi"/>
+                <w:color w:val="000000" w:themeColor="text1"/>
+              </w:rPr>
+              <w:t>open</w:t>
+            </w:r>
+            <w:r>
+              <w:rPr>
+                <w:rFonts w:asciiTheme="majorHAnsi" w:eastAsiaTheme="majorEastAsia" w:hAnsiTheme="majorHAnsi" w:cstheme="majorBidi"/>
+                <w:color w:val="000000" w:themeColor="text1"/>
+              </w:rPr>
+              <w:t>?</w:t>
+            </w:r>
+          </w:p>
+        </w:tc>
+        <w:tc>
+          <w:tcPr>
+            <w:tcW w:w="3780" w:type="dxa"/>
+            <w:tcBorders>
+              <w:top w:val="single" w:sz="4" w:space="0" w:color="BFBFBF" w:themeColor="background1" w:themeShade="BF"/>
+              <w:left w:val="nil"/>
+              <w:bottom w:val="single" w:sz="4" w:space="0" w:color="BFBFBF" w:themeColor="background1" w:themeShade="BF"/>
+              <w:right w:val="nil"/>
+            </w:tcBorders>
+            <w:shd w:val="clear" w:color="auto" w:fill="FFFFFF" w:themeFill="background1"/>
+          </w:tcPr>
+          <w:p>
+            <w:pPr>
+              <w:cnfStyle w:val="000000000000" w:firstRow="0" w:lastRow="0" w:firstColumn="0" w:lastColumn="0" w:oddVBand="0" w:evenVBand="0" w:oddHBand="0" w:evenHBand="0" w:firstRowFirstColumn="0" w:firstRowLastColumn="0" w:lastRowFirstColumn="0" w:lastRowLastColumn="0"/>
+              <w:rPr>
+                <w:rFonts w:asciiTheme="majorHAnsi" w:eastAsiaTheme="majorEastAsia" w:hAnsiTheme="majorHAnsi" w:cstheme="majorBidi"/>
+                <w:color w:val="000000" w:themeColor="text1"/>
+              </w:rPr>
+            </w:pPr>
+            <w:r>
+              <w:rPr>
+                <w:rFonts w:asciiTheme="majorHAnsi" w:eastAsiaTheme="majorEastAsia" w:hAnsiTheme="majorHAnsi" w:cstheme="majorBidi"/>
+                <w:color w:val="000000" w:themeColor="text1"/>
+              </w:rPr>
+              <w:t xml:space="preserve">Will it eventually replace me?  </w:t>
+            </w:r>
+            <w:r>
+              <w:rPr>
+                <w:rFonts w:asciiTheme="majorHAnsi" w:eastAsiaTheme="majorEastAsia" w:hAnsiTheme="majorHAnsi" w:cstheme="majorBidi"/>
+                <w:color w:val="000000" w:themeColor="text1"/>
+              </w:rPr>
+              <w:br/>
+            </w:r>
+            <w:r>
+              <w:rPr>
+                <w:rFonts w:asciiTheme="majorHAnsi" w:eastAsiaTheme="majorEastAsia" w:hAnsiTheme="majorHAnsi" w:cstheme="majorBidi"/>
+                <w:color w:val="000000" w:themeColor="text1"/>
+              </w:rPr>
+              <w:t>How can I stay relevant?</w:t>
+            </w:r>
+          </w:p>
+        </w:tc>
+      </w:tr>
+      <w:tr>
+        <w:trPr>
+          <w:cnfStyle w:val="000000100000" w:firstRow="0" w:lastRow="0" w:firstColumn="0" w:lastColumn="0" w:oddVBand="0" w:evenVBand="0" w:oddHBand="1" w:evenHBand="0" w:firstRowFirstColumn="0" w:firstRowLastColumn="0" w:lastRowFirstColumn="0" w:lastRowLastColumn="0"/>
+          <w:trHeight w:val="755"/>
+        </w:trPr>
+        <w:tc>
+          <w:tcPr>
+            <w:cnfStyle w:val="001000000000" w:firstRow="0" w:lastRow="0" w:firstColumn="1" w:lastColumn="0" w:oddVBand="0" w:evenVBand="0" w:oddHBand="0" w:evenHBand="0" w:firstRowFirstColumn="0" w:firstRowLastColumn="0" w:lastRowFirstColumn="0" w:lastRowLastColumn="0"/>
+            <w:tcW w:w="1170" w:type="dxa"/>
+            <w:tcBorders>
+              <w:right w:val="nil"/>
+            </w:tcBorders>
+            <w:shd w:val="clear" w:color="auto" w:fill="00B050"/>
+          </w:tcPr>
+          <w:p>
+            <w:pPr>
+              <w:rPr>
+                <w:rFonts w:asciiTheme="majorHAnsi" w:eastAsiaTheme="majorEastAsia" w:hAnsiTheme="majorHAnsi" w:cstheme="majorBidi"/>
+              </w:rPr>
+            </w:pPr>
+            <w:r>
+              <w:rPr>
+                <w:rFonts w:asciiTheme="majorHAnsi" w:eastAsiaTheme="majorEastAsia" w:hAnsiTheme="majorHAnsi" w:cstheme="majorBidi"/>
+              </w:rPr>
+              <w:t xml:space="preserve">Our </w:t>
+            </w:r>
+            <w:r>
+              <w:rPr>
+                <w:rFonts w:asciiTheme="majorHAnsi" w:eastAsiaTheme="majorEastAsia" w:hAnsiTheme="majorHAnsi" w:cstheme="majorBidi"/>
+              </w:rPr>
+              <w:t>World</w:t>
+            </w:r>
+          </w:p>
+        </w:tc>
+        <w:tc>
+          <w:tcPr>
+            <w:tcW w:w="3330" w:type="dxa"/>
+            <w:tcBorders>
+              <w:top w:val="single" w:sz="4" w:space="0" w:color="BFBFBF" w:themeColor="background1" w:themeShade="BF"/>
+              <w:left w:val="nil"/>
+              <w:bottom w:val="nil"/>
+              <w:right w:val="nil"/>
+            </w:tcBorders>
+            <w:shd w:val="clear" w:color="auto" w:fill="FFFFFF" w:themeFill="background1"/>
+          </w:tcPr>
+          <w:p>
+            <w:pPr>
+              <w:cnfStyle w:val="000000100000" w:firstRow="0" w:lastRow="0" w:firstColumn="0" w:lastColumn="0" w:oddVBand="0" w:evenVBand="0" w:oddHBand="1" w:evenHBand="0" w:firstRowFirstColumn="0" w:firstRowLastColumn="0" w:lastRowFirstColumn="0" w:lastRowLastColumn="0"/>
+              <w:rPr>
+                <w:rFonts w:asciiTheme="majorHAnsi" w:eastAsiaTheme="majorEastAsia" w:hAnsiTheme="majorHAnsi" w:cstheme="majorBidi"/>
+                <w:color w:val="000000" w:themeColor="text1"/>
+              </w:rPr>
+            </w:pPr>
+            <w:r>
+              <w:rPr>
+                <w:rFonts w:asciiTheme="majorHAnsi" w:eastAsiaTheme="majorEastAsia" w:hAnsiTheme="majorHAnsi" w:cstheme="majorBidi"/>
+                <w:color w:val="000000" w:themeColor="text1"/>
+              </w:rPr>
+              <w:t xml:space="preserve">How can it help </w:t>
+            </w:r>
+            <w:r>
+              <w:rPr>
+                <w:rFonts w:asciiTheme="majorHAnsi" w:eastAsiaTheme="majorEastAsia" w:hAnsiTheme="majorHAnsi" w:cstheme="majorBidi"/>
+                <w:color w:val="000000" w:themeColor="text1"/>
+              </w:rPr>
+              <w:t>our</w:t>
+            </w:r>
+            <w:r>
+              <w:rPr>
+                <w:rFonts w:asciiTheme="majorHAnsi" w:eastAsiaTheme="majorEastAsia" w:hAnsiTheme="majorHAnsi" w:cstheme="majorBidi"/>
+                <w:color w:val="000000" w:themeColor="text1"/>
+              </w:rPr>
+              <w:t xml:space="preserve"> world</w:t>
+            </w:r>
+            <w:r>
+              <w:rPr>
+                <w:rFonts w:asciiTheme="majorHAnsi" w:eastAsiaTheme="majorEastAsia" w:hAnsiTheme="majorHAnsi" w:cstheme="majorBidi"/>
+                <w:color w:val="000000" w:themeColor="text1"/>
+              </w:rPr>
+              <w:t>?</w:t>
+            </w:r>
+          </w:p>
+        </w:tc>
+        <w:tc>
+          <w:tcPr>
+            <w:tcW w:w="3780" w:type="dxa"/>
+            <w:tcBorders>
+              <w:top w:val="single" w:sz="4" w:space="0" w:color="BFBFBF" w:themeColor="background1" w:themeShade="BF"/>
+              <w:left w:val="nil"/>
+              <w:bottom w:val="nil"/>
+              <w:right w:val="nil"/>
+            </w:tcBorders>
+            <w:shd w:val="clear" w:color="auto" w:fill="FFFFFF" w:themeFill="background1"/>
+          </w:tcPr>
+          <w:p>
+            <w:pPr>
+              <w:cnfStyle w:val="000000100000" w:firstRow="0" w:lastRow="0" w:firstColumn="0" w:lastColumn="0" w:oddVBand="0" w:evenVBand="0" w:oddHBand="1" w:evenHBand="0" w:firstRowFirstColumn="0" w:firstRowLastColumn="0" w:lastRowFirstColumn="0" w:lastRowLastColumn="0"/>
+              <w:rPr>
+                <w:rFonts w:asciiTheme="majorHAnsi" w:eastAsiaTheme="majorEastAsia" w:hAnsiTheme="majorHAnsi" w:cstheme="majorBidi"/>
+                <w:color w:val="000000" w:themeColor="text1"/>
+              </w:rPr>
+            </w:pPr>
+            <w:r>
+              <w:rPr>
+                <w:rFonts w:asciiTheme="majorHAnsi" w:eastAsiaTheme="majorEastAsia" w:hAnsiTheme="majorHAnsi" w:cstheme="majorBidi"/>
+                <w:color w:val="000000" w:themeColor="text1"/>
+              </w:rPr>
+              <w:t xml:space="preserve">Will it lead to a dystopia?  </w:t>
+            </w:r>
+            <w:r>
+              <w:rPr>
+                <w:rFonts w:asciiTheme="majorHAnsi" w:eastAsiaTheme="majorEastAsia" w:hAnsiTheme="majorHAnsi" w:cstheme="majorBidi"/>
+                <w:color w:val="000000" w:themeColor="text1"/>
+              </w:rPr>
+              <w:br/>
+              <w:t>How can I help make sure it doesn’t?</w:t>
+            </w:r>
+          </w:p>
+        </w:tc>
+      </w:tr>
+    </w:tbl>
+    <w:p>
+      <w:pPr>
+        <w:rPr>
+          <w:rFonts w:ascii="Calibri" w:eastAsiaTheme="majorEastAsia" w:hAnsi="Calibri" w:cs="Calibri"/>
+          <w:color w:val="2F5496" w:themeColor="accent1" w:themeShade="BF"/>
+        </w:rPr>
+      </w:pPr>
+      <w:r>
+        <w:rPr>
+          <w:rFonts w:ascii="Calibri" w:eastAsiaTheme="majorEastAsia" w:hAnsi="Calibri" w:cs="Calibri"/>
+          <w:color w:val="2F5496" w:themeColor="accent1" w:themeShade="BF"/>
+        </w:rPr>
+        <w:br/>
+      </w:r>
+    </w:p>
+    <w:p>
+      <w:pPr>
+        <w:pStyle w:val="ListParagraph"/>
+        <w:numPr>
+          <w:ilvl w:val="0"/>
+          <w:numId w:val="1"/>
+        </w:numPr>
+        <w:rPr>
+          <w:rFonts w:eastAsiaTheme="majorEastAsia" w:cstheme="minorHAnsi"/>
+          <w:b/>
+          <w:bCs/>
+          <w:color w:val="2F5496" w:themeColor="accent1" w:themeShade="BF"/>
+        </w:rPr>
+      </w:pPr>
+      <w:r>
+        <w:rPr>
+          <w:rFonts w:cstheme="minorHAnsi"/>
+          <w:b/>
+          <w:bCs/>
+        </w:rPr>
+        <w:t xml:space="preserve">Regardless of how excited </w:t>
+      </w:r>
+      <w:r>
+        <w:rPr>
+          <w:rFonts w:cstheme="minorHAnsi"/>
+          <w:b/>
+          <w:bCs/>
+        </w:rPr>
+        <w:t>or</w:t>
+      </w:r>
+      <w:r>
+        <w:rPr>
+          <w:rFonts w:cstheme="minorHAnsi"/>
+          <w:b/>
+          <w:bCs/>
+        </w:rPr>
+        <w:t xml:space="preserve"> fearful you are, </w:t>
+      </w:r>
+      <w:r>
+        <w:rPr>
+          <w:rFonts w:cstheme="minorHAnsi"/>
+          <w:b/>
+          <w:bCs/>
+          <w:i/>
+          <w:iCs/>
+        </w:rPr>
+        <w:t>knowledge is power</w:t>
+      </w:r>
+      <w:r>
+        <w:rPr>
+          <w:rFonts w:cstheme="minorHAnsi"/>
+          <w:b/>
+          <w:bCs/>
+        </w:rPr>
+        <w:t>.</w:t>
+      </w:r>
+      <w:r>
+        <w:rPr>
+          <w:rFonts w:cstheme="minorHAnsi"/>
+          <w:b/>
+          <w:bCs/>
+        </w:rPr>
+        <w:br/>
+      </w:r>
+      <w:r>
+        <w:rPr>
+          <w:rFonts w:cstheme="minorHAnsi"/>
+          <w:b/>
+          <w:bCs/>
+        </w:rPr>
+        <w:br/>
+        <w:t>K</w:t>
+      </w:r>
+      <w:r>
+        <w:rPr>
+          <w:rFonts w:cstheme="minorHAnsi"/>
+          <w:b/>
+          <w:bCs/>
+        </w:rPr>
+        <w:t xml:space="preserve">nowing how to use AI to </w:t>
+      </w:r>
+      <w:r>
+        <w:rPr>
+          <w:rFonts w:cstheme="minorHAnsi"/>
+          <w:b/>
+          <w:bCs/>
+          <w:i/>
+          <w:iCs/>
+        </w:rPr>
+        <w:t>systematically</w:t>
+      </w:r>
+      <w:r>
+        <w:rPr>
+          <w:rFonts w:cstheme="minorHAnsi"/>
+          <w:b/>
+          <w:bCs/>
+        </w:rPr>
+        <w:t xml:space="preserve"> </w:t>
+      </w:r>
+      <w:r>
+        <w:rPr>
+          <w:rFonts w:cstheme="minorHAnsi"/>
+          <w:b/>
+          <w:bCs/>
+        </w:rPr>
+        <w:t xml:space="preserve">accelerate </w:t>
+      </w:r>
+      <w:r>
+        <w:rPr>
+          <w:rFonts w:cstheme="minorHAnsi"/>
+          <w:b/>
+          <w:bCs/>
+        </w:rPr>
+        <w:t>succe</w:t>
+      </w:r>
+      <w:r>
+        <w:rPr>
+          <w:rFonts w:cstheme="minorHAnsi"/>
+          <w:b/>
+          <w:bCs/>
+        </w:rPr>
+        <w:t>ss</w:t>
+      </w:r>
+      <w:r>
+        <w:rPr>
+          <w:rFonts w:cstheme="minorHAnsi"/>
+          <w:b/>
+          <w:bCs/>
+        </w:rPr>
+        <w:t xml:space="preserve"> in the age of AI</w:t>
+      </w:r>
+      <w:r>
+        <w:rPr>
+          <w:rFonts w:cstheme="minorHAnsi"/>
+          <w:b/>
+          <w:bCs/>
+        </w:rPr>
+        <w:t xml:space="preserve"> will give you agency to seize </w:t>
+      </w:r>
+      <w:r>
+        <w:rPr>
+          <w:rFonts w:cstheme="minorHAnsi"/>
+          <w:b/>
+          <w:bCs/>
+        </w:rPr>
+        <w:t>the</w:t>
+      </w:r>
+      <w:r>
+        <w:rPr>
+          <w:rFonts w:cstheme="minorHAnsi"/>
+          <w:b/>
+          <w:bCs/>
+        </w:rPr>
+        <w:t xml:space="preserve"> </w:t>
+      </w:r>
+      <w:r>
+        <w:rPr>
+          <w:rFonts w:cstheme="minorHAnsi"/>
+          <w:b/>
+          <w:bCs/>
+        </w:rPr>
+        <w:t>opportunit</w:t>
+      </w:r>
+      <w:r>
+        <w:rPr>
+          <w:rFonts w:cstheme="minorHAnsi"/>
+          <w:b/>
+          <w:bCs/>
+        </w:rPr>
+        <w:t xml:space="preserve">ies and overcome </w:t>
+      </w:r>
+      <w:r>
+        <w:rPr>
+          <w:rFonts w:cstheme="minorHAnsi"/>
+          <w:b/>
+          <w:bCs/>
+        </w:rPr>
+        <w:t xml:space="preserve">the </w:t>
+      </w:r>
+      <w:r>
+        <w:rPr>
+          <w:rFonts w:cstheme="minorHAnsi"/>
+          <w:b/>
+          <w:bCs/>
+        </w:rPr>
+        <w:t>challenges</w:t>
+      </w:r>
+      <w:r>
+        <w:rPr>
+          <w:rFonts w:cstheme="minorHAnsi"/>
+          <w:b/>
+          <w:bCs/>
+        </w:rPr>
+        <w:t xml:space="preserve"> </w:t>
+      </w:r>
+      <w:r>
+        <w:rPr>
+          <w:rFonts w:cstheme="minorHAnsi"/>
+          <w:b/>
+          <w:bCs/>
+        </w:rPr>
+        <w:t>you face</w:t>
+      </w:r>
+      <w:r>
+        <w:rPr>
+          <w:rFonts w:cstheme="minorHAnsi"/>
+          <w:b/>
+          <w:bCs/>
+        </w:rPr>
+        <w:t>.</w:t>
+      </w:r>
+    </w:p>
+    <w:p>
+      <w:pPr>
+        <w:pStyle w:val="ListParagraph"/>
+        <w:numPr>
+          <w:ilvl w:val="1"/>
+          <w:numId w:val="1"/>
+        </w:numPr>
+        <w:rPr>
+          <w:rFonts w:eastAsiaTheme="majorEastAsia" w:cstheme="minorHAnsi"/>
+          <w:color w:val="2F5496" w:themeColor="accent1" w:themeShade="BF"/>
+        </w:rPr>
+      </w:pPr>
+      <w:r>
+        <w:rPr>
+          <w:rFonts w:cstheme="minorHAnsi"/>
+        </w:rPr>
+        <w:t xml:space="preserve">There are many ways to </w:t>
+      </w:r>
+      <w:r>
+        <w:rPr>
+          <w:rFonts w:cstheme="minorHAnsi"/>
+        </w:rPr>
+        <w:t xml:space="preserve">grow </w:t>
+      </w:r>
+      <w:r>
+        <w:rPr>
+          <w:rFonts w:cstheme="minorHAnsi"/>
+        </w:rPr>
+        <w:t>value</w:t>
+      </w:r>
+      <w:r>
+        <w:rPr>
+          <w:rFonts w:cstheme="minorHAnsi"/>
+        </w:rPr>
+        <w:t xml:space="preserve">.  </w:t>
+      </w:r>
+    </w:p>
+    <w:p>
+      <w:pPr>
+        <w:pStyle w:val="ListParagraph"/>
+        <w:numPr>
+          <w:ilvl w:val="1"/>
+          <w:numId w:val="1"/>
+        </w:numPr>
+        <w:rPr>
+          <w:rFonts w:eastAsiaTheme="majorEastAsia" w:cstheme="minorHAnsi"/>
+          <w:color w:val="2F5496" w:themeColor="accent1" w:themeShade="BF"/>
+        </w:rPr>
+      </w:pPr>
+      <w:r>
+        <w:rPr>
+          <w:rFonts w:cstheme="minorHAnsi"/>
+        </w:rPr>
+        <w:t xml:space="preserve">AI can help you </w:t>
+      </w:r>
+      <w:r>
+        <w:rPr>
+          <w:rFonts w:cstheme="minorHAnsi"/>
+          <w:i/>
+          <w:iCs/>
+        </w:rPr>
+        <w:t>systematically</w:t>
+      </w:r>
+      <w:r>
+        <w:rPr>
+          <w:rFonts w:cstheme="minorHAnsi"/>
+        </w:rPr>
+        <w:t xml:space="preserve"> </w:t>
+      </w:r>
+      <w:r>
+        <w:rPr>
+          <w:rFonts w:cstheme="minorHAnsi"/>
+        </w:rPr>
+        <w:t xml:space="preserve">grow value </w:t>
+      </w:r>
+      <w:r>
+        <w:rPr>
+          <w:rFonts w:cstheme="minorHAnsi"/>
+        </w:rPr>
+        <w:t xml:space="preserve">the fastest way – </w:t>
+      </w:r>
+      <w:r>
+        <w:rPr>
+          <w:rFonts w:cstheme="minorHAnsi"/>
+          <w:color w:val="000000" w:themeColor="text1"/>
+        </w:rPr>
+        <w:t>exponentially</w:t>
+      </w:r>
+      <w:r>
+        <w:rPr>
+          <w:rFonts w:cstheme="minorHAnsi"/>
+        </w:rPr>
+        <w:t>.</w:t>
+      </w:r>
+    </w:p>
+    <w:p>
+      <w:pPr>
+        <w:pStyle w:val="ListParagraph"/>
+        <w:numPr>
+          <w:ilvl w:val="1"/>
+          <w:numId w:val="1"/>
+        </w:numPr>
+        <w:rPr>
+          <w:rFonts w:eastAsiaTheme="majorEastAsia" w:cstheme="minorHAnsi"/>
+          <w:color w:val="2F5496" w:themeColor="accent1" w:themeShade="BF"/>
+        </w:rPr>
+      </w:pPr>
+      <w:r>
+        <w:rPr>
+          <w:rFonts w:cstheme="minorHAnsi"/>
+        </w:rPr>
+        <w:t>Leaders</w:t>
+      </w:r>
+      <w:r>
+        <w:rPr>
+          <w:rFonts w:cstheme="minorHAnsi"/>
+        </w:rPr>
+        <w:t xml:space="preserve"> can </w:t>
+      </w:r>
+      <w:r>
+        <w:rPr>
+          <w:rFonts w:cstheme="minorHAnsi"/>
+          <w:b/>
+          <w:bCs/>
+          <w:i/>
+          <w:iCs/>
+          <w:color w:val="00B050"/>
+        </w:rPr>
+        <w:t>grow value exponentially</w:t>
+      </w:r>
+      <w:r>
+        <w:rPr>
+          <w:rFonts w:cstheme="minorHAnsi"/>
+        </w:rPr>
+        <w:t xml:space="preserve"> by using AI together with </w:t>
+      </w:r>
+      <w:r>
+        <w:rPr>
+          <w:rFonts w:cstheme="minorHAnsi"/>
+        </w:rPr>
+        <w:t>other proven value accelerators</w:t>
+      </w:r>
+      <w:r>
+        <w:rPr>
+          <w:rFonts w:cstheme="minorHAnsi"/>
+        </w:rPr>
+        <w:t xml:space="preserve"> </w:t>
+      </w:r>
+      <w:r>
+        <w:rPr>
+          <w:rFonts w:cstheme="minorHAnsi"/>
+        </w:rPr>
+        <w:t xml:space="preserve">including </w:t>
+      </w:r>
+      <w:r>
+        <w:rPr>
+          <w:rFonts w:cstheme="minorHAnsi"/>
+        </w:rPr>
+        <w:t xml:space="preserve">compounding innovation, </w:t>
+      </w:r>
+      <w:r>
+        <w:rPr>
+          <w:rFonts w:cstheme="minorHAnsi"/>
+        </w:rPr>
+        <w:t>network effects, viral ideation, and generative learning</w:t>
+      </w:r>
+      <w:r>
+        <w:rPr>
+          <w:rFonts w:cstheme="minorHAnsi"/>
+        </w:rPr>
+        <w:t>.</w:t>
+      </w:r>
+      <w:r>
+        <w:rPr>
+          <w:rFonts w:cstheme="minorHAnsi"/>
+        </w:rPr>
+        <w:br/>
+      </w:r>
+    </w:p>
+    <w:p>
+      <w:pPr>
+        <w:pStyle w:val="ListParagraph"/>
+        <w:ind w:left="1440"/>
+        <w:rPr>
+          <w:rFonts w:eastAsiaTheme="majorEastAsia" w:cstheme="minorHAnsi"/>
+          <w:color w:val="2F5496" w:themeColor="accent1" w:themeShade="BF"/>
+        </w:rPr>
+      </w:pPr>
+    </w:p>
+    <w:p>
+      <w:pPr>
+        <w:pStyle w:val="ListParagraph"/>
+        <w:numPr>
+          <w:ilvl w:val="0"/>
+          <w:numId w:val="1"/>
+        </w:numPr>
+        <w:rPr>
+          <w:rFonts w:eastAsiaTheme="majorEastAsia" w:cstheme="minorHAnsi"/>
+          <w:b/>
+          <w:bCs/>
+          <w:color w:val="2F5496" w:themeColor="accent1" w:themeShade="BF"/>
+        </w:rPr>
+      </w:pPr>
+      <w:r>
+        <w:rPr>
+          <w:rFonts w:cstheme="minorHAnsi"/>
+          <w:b/>
+          <w:bCs/>
+        </w:rPr>
+        <w:t xml:space="preserve">AI is evolving so quickly, it’s impossible for </w:t>
+      </w:r>
+      <w:r>
+        <w:rPr>
+          <w:rFonts w:cstheme="minorHAnsi"/>
+          <w:b/>
+          <w:bCs/>
+        </w:rPr>
+        <w:t>individuals to keep up on their own</w:t>
+      </w:r>
+    </w:p>
+    <w:p>
+      <w:pPr>
+        <w:pStyle w:val="ListParagraph"/>
+        <w:numPr>
+          <w:ilvl w:val="1"/>
+          <w:numId w:val="1"/>
+        </w:numPr>
+        <w:rPr>
+          <w:rFonts w:eastAsiaTheme="majorEastAsia" w:cstheme="minorHAnsi"/>
+          <w:color w:val="2F5496" w:themeColor="accent1" w:themeShade="BF"/>
+        </w:rPr>
+      </w:pPr>
+      <w:r>
+        <w:rPr>
+          <w:rFonts w:cstheme="minorHAnsi"/>
+        </w:rPr>
+        <w:t xml:space="preserve">Wise leaders </w:t>
+      </w:r>
+      <w:r>
+        <w:rPr>
+          <w:rFonts w:cstheme="minorHAnsi"/>
+        </w:rPr>
+        <w:t xml:space="preserve">look for </w:t>
+      </w:r>
+      <w:r>
+        <w:rPr>
+          <w:rFonts w:cstheme="minorHAnsi"/>
+        </w:rPr>
+        <w:t xml:space="preserve">ways </w:t>
+      </w:r>
+      <w:r>
+        <w:rPr>
+          <w:rFonts w:cstheme="minorHAnsi"/>
+        </w:rPr>
+        <w:t xml:space="preserve">to learn from </w:t>
+      </w:r>
+      <w:r>
+        <w:rPr>
+          <w:rFonts w:cstheme="minorHAnsi"/>
+        </w:rPr>
+        <w:t xml:space="preserve">their </w:t>
+      </w:r>
+      <w:r>
+        <w:rPr>
+          <w:rFonts w:cstheme="minorHAnsi"/>
+        </w:rPr>
+        <w:t>mentors</w:t>
+      </w:r>
+      <w:r>
+        <w:rPr>
+          <w:rFonts w:cstheme="minorHAnsi"/>
+        </w:rPr>
+        <w:t xml:space="preserve"> and peer</w:t>
+      </w:r>
+      <w:r>
+        <w:rPr>
+          <w:rFonts w:cstheme="minorHAnsi"/>
+        </w:rPr>
+        <w:t>s</w:t>
+      </w:r>
+      <w:r>
+        <w:rPr>
+          <w:rFonts w:cstheme="minorHAnsi"/>
+        </w:rPr>
+        <w:t>.</w:t>
+      </w:r>
+    </w:p>
+    <w:p>
+      <w:pPr>
+        <w:pStyle w:val="ListParagraph"/>
+        <w:numPr>
+          <w:ilvl w:val="1"/>
+          <w:numId w:val="1"/>
+        </w:numPr>
+        <w:rPr>
+          <w:rFonts w:eastAsiaTheme="majorEastAsia" w:cstheme="minorHAnsi"/>
+          <w:color w:val="2F5496" w:themeColor="accent1" w:themeShade="BF"/>
+        </w:rPr>
+      </w:pPr>
+      <w:r>
+        <w:rPr>
+          <w:rFonts w:cstheme="minorHAnsi"/>
+        </w:rPr>
+        <w:t>However, networking takes time, energy, and money</w:t>
+      </w:r>
+      <w:r>
+        <w:rPr>
+          <w:rFonts w:cstheme="minorHAnsi"/>
+        </w:rPr>
+        <w:t xml:space="preserve"> – </w:t>
+      </w:r>
+      <w:r>
+        <w:rPr>
+          <w:rFonts w:cstheme="minorHAnsi"/>
+        </w:rPr>
+        <w:t>and</w:t>
+      </w:r>
+      <w:r>
+        <w:rPr>
+          <w:rFonts w:cstheme="minorHAnsi"/>
+        </w:rPr>
+        <w:t xml:space="preserve"> with so </w:t>
+      </w:r>
+      <w:r>
+        <w:rPr>
+          <w:rFonts w:cstheme="minorHAnsi"/>
+        </w:rPr>
+        <w:t xml:space="preserve">much information </w:t>
+      </w:r>
+      <w:r>
+        <w:rPr>
+          <w:rFonts w:cstheme="minorHAnsi"/>
+        </w:rPr>
+        <w:t xml:space="preserve">available through so many social media channels and online forums, </w:t>
+      </w:r>
+      <w:r>
+        <w:rPr>
+          <w:rFonts w:cstheme="minorHAnsi"/>
+        </w:rPr>
+        <w:t xml:space="preserve">choosing </w:t>
+      </w:r>
+      <w:r>
+        <w:rPr>
+          <w:rFonts w:cstheme="minorHAnsi"/>
+        </w:rPr>
+        <w:t>where, when,</w:t>
+      </w:r>
+      <w:r>
+        <w:rPr>
+          <w:rFonts w:cstheme="minorHAnsi"/>
+        </w:rPr>
+        <w:t xml:space="preserve"> and how </w:t>
+      </w:r>
+      <w:r>
+        <w:rPr>
+          <w:rFonts w:cstheme="minorHAnsi"/>
+        </w:rPr>
+        <w:t xml:space="preserve">to </w:t>
+      </w:r>
+      <w:r>
+        <w:rPr>
+          <w:rFonts w:cstheme="minorHAnsi"/>
+        </w:rPr>
+        <w:t xml:space="preserve">invest </w:t>
+      </w:r>
+      <w:r>
+        <w:rPr>
+          <w:rFonts w:cstheme="minorHAnsi"/>
+        </w:rPr>
+        <w:t xml:space="preserve">in </w:t>
+      </w:r>
+      <w:r>
+        <w:rPr>
+          <w:rFonts w:cstheme="minorHAnsi"/>
+        </w:rPr>
+        <w:t>yourself</w:t>
+      </w:r>
+      <w:r>
+        <w:rPr>
+          <w:rFonts w:cstheme="minorHAnsi"/>
+        </w:rPr>
+        <w:t xml:space="preserve"> </w:t>
+      </w:r>
+      <w:r>
+        <w:rPr>
+          <w:rFonts w:cstheme="minorHAnsi"/>
+        </w:rPr>
+        <w:t xml:space="preserve">is </w:t>
+      </w:r>
+      <w:r>
+        <w:rPr>
+          <w:rFonts w:cstheme="minorHAnsi"/>
+        </w:rPr>
+        <w:t xml:space="preserve">often </w:t>
+      </w:r>
+      <w:r>
+        <w:rPr>
+          <w:rFonts w:cstheme="minorHAnsi"/>
+        </w:rPr>
+        <w:t>overwhelming</w:t>
+      </w:r>
+      <w:r>
+        <w:rPr>
+          <w:rFonts w:cstheme="minorHAnsi"/>
+        </w:rPr>
+        <w:t>.</w:t>
+      </w:r>
+    </w:p>
+    <w:p>
+      <w:pPr>
+        <w:rPr>
+          <w:rFonts w:eastAsiaTheme="majorEastAsia" w:cstheme="minorHAnsi"/>
+          <w:color w:val="2F5496" w:themeColor="accent1" w:themeShade="BF"/>
+        </w:rPr>
+      </w:pPr>
+      <w:r>
+        <w:rPr>
+          <w:rFonts w:eastAsiaTheme="majorEastAsia" w:cstheme="minorHAnsi"/>
+          <w:color w:val="2F5496" w:themeColor="accent1" w:themeShade="BF"/>
+        </w:rPr>
+        <w:br w:type="page"/>
+      </w:r>
+    </w:p>
+    <w:p>
+      <w:pPr>
+        <w:pStyle w:val="ListParagraph"/>
+        <w:ind w:left="1440"/>
+        <w:rPr>
+          <w:rFonts w:eastAsiaTheme="majorEastAsia" w:cstheme="minorHAnsi"/>
+          <w:color w:val="2F5496" w:themeColor="accent1" w:themeShade="BF"/>
+        </w:rPr>
+      </w:pPr>
+    </w:p>
+    <w:p>
+      <w:pPr>
+        <w:pStyle w:val="ListParagraph"/>
+        <w:ind w:left="1440"/>
+        <w:rPr>
+          <w:rFonts w:eastAsiaTheme="majorEastAsia" w:cstheme="minorHAnsi"/>
+          <w:color w:val="2F5496" w:themeColor="accent1" w:themeShade="BF"/>
+        </w:rPr>
+      </w:pPr>
+    </w:p>
+    <w:p>
+      <w:pPr>
+        <w:pStyle w:val="ListParagraph"/>
+        <w:numPr>
+          <w:ilvl w:val="0"/>
+          <w:numId w:val="1"/>
+        </w:numPr>
+        <w:rPr>
+          <w:rFonts w:eastAsiaTheme="majorEastAsia" w:cstheme="minorHAnsi"/>
+          <w:color w:val="2F5496" w:themeColor="accent1" w:themeShade="BF"/>
+        </w:rPr>
+      </w:pPr>
+      <w:r>
+        <w:rPr>
+          <w:rFonts w:cstheme="minorHAnsi"/>
+          <w:b/>
+          <w:bCs/>
+        </w:rPr>
+        <w:t xml:space="preserve">The </w:t>
+      </w:r>
+      <w:r>
+        <w:rPr>
+          <w:rFonts w:cstheme="minorHAnsi"/>
+          <w:b/>
+          <w:bCs/>
+        </w:rPr>
+        <w:t xml:space="preserve">new </w:t>
+      </w:r>
+      <w:r>
+        <w:rPr>
+          <w:rFonts w:cstheme="minorHAnsi"/>
+          <w:b/>
+          <w:bCs/>
+        </w:rPr>
+        <w:t xml:space="preserve">AccelRR8 Consortium NonProfit was formed </w:t>
+      </w:r>
+      <w:r>
+        <w:rPr>
+          <w:rFonts w:cstheme="minorHAnsi"/>
+          <w:b/>
+          <w:bCs/>
+        </w:rPr>
+        <w:t xml:space="preserve">specifically </w:t>
+      </w:r>
+      <w:r>
+        <w:rPr>
+          <w:rFonts w:cstheme="minorHAnsi"/>
+          <w:b/>
+          <w:bCs/>
+        </w:rPr>
+        <w:t xml:space="preserve">to help leaders </w:t>
+      </w:r>
+      <w:r>
+        <w:rPr>
+          <w:rFonts w:cstheme="minorHAnsi"/>
+          <w:b/>
+          <w:bCs/>
+        </w:rPr>
+        <w:t xml:space="preserve">– who </w:t>
+      </w:r>
+      <w:r>
+        <w:rPr>
+          <w:rFonts w:cstheme="minorHAnsi"/>
+          <w:b/>
+          <w:bCs/>
+        </w:rPr>
+        <w:t>share</w:t>
+      </w:r>
+      <w:r>
+        <w:rPr>
+          <w:rFonts w:cstheme="minorHAnsi"/>
+          <w:b/>
+          <w:bCs/>
+        </w:rPr>
+        <w:t xml:space="preserve"> an</w:t>
+      </w:r>
+      <w:r>
+        <w:rPr>
+          <w:rFonts w:cstheme="minorHAnsi"/>
+          <w:b/>
+          <w:bCs/>
+        </w:rPr>
+        <w:t xml:space="preserve"> interest </w:t>
+      </w:r>
+      <w:r>
+        <w:rPr>
+          <w:rFonts w:cstheme="minorHAnsi"/>
+          <w:b/>
+          <w:bCs/>
+        </w:rPr>
+        <w:t xml:space="preserve">in accelerating success – </w:t>
+      </w:r>
+      <w:r>
+        <w:rPr>
+          <w:rFonts w:cstheme="minorHAnsi"/>
+          <w:b/>
+          <w:bCs/>
+        </w:rPr>
+        <w:t xml:space="preserve">keep up </w:t>
+      </w:r>
+      <w:r>
+        <w:rPr>
+          <w:rFonts w:cstheme="minorHAnsi"/>
+          <w:b/>
+          <w:bCs/>
+        </w:rPr>
+        <w:t xml:space="preserve">together </w:t>
+      </w:r>
+      <w:r>
+        <w:rPr>
+          <w:rFonts w:cstheme="minorHAnsi"/>
+          <w:b/>
+          <w:bCs/>
+        </w:rPr>
+        <w:t>as AI evolves</w:t>
+      </w:r>
+      <w:r>
+        <w:rPr>
+          <w:rFonts w:cstheme="minorHAnsi"/>
+          <w:b/>
+          <w:bCs/>
+        </w:rPr>
+        <w:t>.</w:t>
+      </w:r>
+      <w:r>
+        <w:rPr>
+          <w:rFonts w:cstheme="minorHAnsi"/>
+        </w:rPr>
+        <w:t xml:space="preserve">  </w:t>
+      </w:r>
+      <w:r>
+        <w:rPr>
+          <w:rFonts w:cstheme="minorHAnsi"/>
+        </w:rPr>
+        <w:br/>
+      </w:r>
+      <w:r>
+        <w:rPr>
+          <w:rFonts w:cstheme="minorHAnsi"/>
+        </w:rPr>
+        <w:br/>
+      </w:r>
+      <w:r>
+        <w:rPr>
+          <w:rFonts w:cstheme="minorHAnsi"/>
+          <w:b/>
+          <w:bCs/>
+        </w:rPr>
+        <w:t>With a free subscription, leaders can:</w:t>
+      </w:r>
+    </w:p>
+    <w:p>
+      <w:pPr>
+        <w:pStyle w:val="ListParagraph"/>
+        <w:numPr>
+          <w:ilvl w:val="1"/>
+          <w:numId w:val="1"/>
+        </w:numPr>
+        <w:rPr>
+          <w:rFonts w:eastAsiaTheme="majorEastAsia" w:cstheme="minorHAnsi"/>
+          <w:color w:val="2F5496" w:themeColor="accent1" w:themeShade="BF"/>
+        </w:rPr>
+      </w:pPr>
+      <w:r>
+        <w:rPr>
+          <w:rFonts w:cstheme="minorHAnsi"/>
+        </w:rPr>
+        <w:t>F</w:t>
+      </w:r>
+      <w:r>
+        <w:rPr>
+          <w:rFonts w:cstheme="minorHAnsi"/>
+        </w:rPr>
+        <w:t xml:space="preserve">ind and connect with </w:t>
+      </w:r>
+      <w:r>
+        <w:rPr>
+          <w:rFonts w:cstheme="minorHAnsi"/>
+        </w:rPr>
+        <w:t xml:space="preserve">influencers, mentors, and peers </w:t>
+      </w:r>
+      <w:r>
+        <w:rPr>
+          <w:rFonts w:cstheme="minorHAnsi"/>
+        </w:rPr>
+        <w:t xml:space="preserve">who share this </w:t>
+      </w:r>
+      <w:r>
+        <w:rPr>
+          <w:rFonts w:cstheme="minorHAnsi"/>
+        </w:rPr>
+        <w:t>interest</w:t>
+      </w:r>
+      <w:r>
+        <w:rPr>
+          <w:rFonts w:cstheme="minorHAnsi"/>
+        </w:rPr>
+        <w:t>.</w:t>
+      </w:r>
+    </w:p>
+    <w:p>
+      <w:pPr>
+        <w:pStyle w:val="ListParagraph"/>
+        <w:numPr>
+          <w:ilvl w:val="1"/>
+          <w:numId w:val="1"/>
+        </w:numPr>
+        <w:rPr>
+          <w:rFonts w:eastAsiaTheme="majorEastAsia" w:cstheme="minorHAnsi"/>
+          <w:color w:val="2F5496" w:themeColor="accent1" w:themeShade="BF"/>
+        </w:rPr>
+      </w:pPr>
+      <w:r>
+        <w:rPr>
+          <w:rFonts w:cstheme="minorHAnsi"/>
+        </w:rPr>
+        <w:t>E</w:t>
+      </w:r>
+      <w:r>
+        <w:rPr>
+          <w:rFonts w:cstheme="minorHAnsi"/>
+        </w:rPr>
+        <w:t xml:space="preserve">xchange ideas and share learnings </w:t>
+      </w:r>
+      <w:r>
+        <w:rPr>
+          <w:rFonts w:cstheme="minorHAnsi"/>
+        </w:rPr>
+        <w:t xml:space="preserve">with one another </w:t>
+      </w:r>
+      <w:r>
+        <w:rPr>
+          <w:rFonts w:cstheme="minorHAnsi"/>
+        </w:rPr>
+        <w:t xml:space="preserve">in person and online </w:t>
+      </w:r>
+      <w:r>
+        <w:rPr>
+          <w:rFonts w:cstheme="minorHAnsi"/>
+        </w:rPr>
+        <w:t xml:space="preserve">through </w:t>
+      </w:r>
+      <w:r>
+        <w:rPr>
+          <w:rFonts w:cstheme="minorHAnsi"/>
+        </w:rPr>
+        <w:t>various</w:t>
+      </w:r>
+      <w:r>
+        <w:rPr>
+          <w:rFonts w:cstheme="minorHAnsi"/>
+        </w:rPr>
+        <w:t xml:space="preserve"> collaboration platforms</w:t>
+      </w:r>
+      <w:r>
+        <w:rPr>
+          <w:rFonts w:cstheme="minorHAnsi"/>
+        </w:rPr>
+        <w:t>.</w:t>
+      </w:r>
+    </w:p>
+    <w:p>
+      <w:pPr>
+        <w:pStyle w:val="ListParagraph"/>
+        <w:numPr>
+          <w:ilvl w:val="1"/>
+          <w:numId w:val="1"/>
+        </w:numPr>
+        <w:rPr>
+          <w:rFonts w:eastAsiaTheme="majorEastAsia" w:cstheme="minorHAnsi"/>
+          <w:color w:val="2F5496" w:themeColor="accent1" w:themeShade="BF"/>
+        </w:rPr>
+      </w:pPr>
+      <w:r>
+        <w:rPr>
+          <w:rFonts w:cstheme="minorHAnsi"/>
+        </w:rPr>
+        <w:t>Explore</w:t>
+      </w:r>
+      <w:r>
+        <w:rPr>
+          <w:rFonts w:cstheme="minorHAnsi"/>
+        </w:rPr>
+        <w:t xml:space="preserve"> </w:t>
+      </w:r>
+      <w:r>
+        <w:rPr>
+          <w:rFonts w:cstheme="minorHAnsi"/>
+        </w:rPr>
+        <w:t xml:space="preserve">shared learnings </w:t>
+      </w:r>
+      <w:r>
+        <w:rPr>
+          <w:rFonts w:cstheme="minorHAnsi"/>
+        </w:rPr>
+        <w:t xml:space="preserve">synthesized </w:t>
+      </w:r>
+      <w:r>
+        <w:rPr>
+          <w:rFonts w:cstheme="minorHAnsi"/>
+        </w:rPr>
+        <w:t xml:space="preserve">in </w:t>
+      </w:r>
+      <w:r>
+        <w:rPr>
+          <w:rFonts w:cstheme="minorHAnsi"/>
+        </w:rPr>
+        <w:t>a</w:t>
+      </w:r>
+      <w:r>
+        <w:rPr>
+          <w:rFonts w:cstheme="minorHAnsi"/>
+        </w:rPr>
+        <w:t xml:space="preserve">n </w:t>
+      </w:r>
+      <w:r>
+        <w:rPr>
+          <w:rFonts w:cstheme="minorHAnsi"/>
+        </w:rPr>
+        <w:t xml:space="preserve">open online </w:t>
+      </w:r>
+      <w:r>
+        <w:rPr>
+          <w:rFonts w:cstheme="minorHAnsi"/>
+        </w:rPr>
+        <w:t>body of knowledge</w:t>
+      </w:r>
+      <w:r>
+        <w:rPr>
+          <w:rFonts w:cstheme="minorHAnsi"/>
+        </w:rPr>
+        <w:t xml:space="preserve"> curated transparently</w:t>
+      </w:r>
+      <w:r>
+        <w:rPr>
+          <w:rFonts w:cstheme="minorHAnsi"/>
+        </w:rPr>
+        <w:t xml:space="preserve"> </w:t>
+      </w:r>
+      <w:r>
+        <w:rPr>
+          <w:rFonts w:cstheme="minorHAnsi"/>
+        </w:rPr>
+        <w:t xml:space="preserve">and continuously </w:t>
+      </w:r>
+      <w:r>
+        <w:rPr>
+          <w:rFonts w:cstheme="minorHAnsi"/>
+        </w:rPr>
+        <w:t xml:space="preserve">by </w:t>
+      </w:r>
+      <w:r>
+        <w:rPr>
+          <w:rFonts w:cstheme="minorHAnsi"/>
+        </w:rPr>
+        <w:t>the Consortium network</w:t>
+      </w:r>
+      <w:r>
+        <w:rPr>
+          <w:rFonts w:cstheme="minorHAnsi"/>
+        </w:rPr>
+        <w:t>.</w:t>
+      </w:r>
+    </w:p>
+    <w:p>
+      <w:pPr>
+        <w:pStyle w:val="ListParagraph"/>
+        <w:numPr>
+          <w:ilvl w:val="1"/>
+          <w:numId w:val="1"/>
+        </w:numPr>
+        <w:rPr>
+          <w:rFonts w:eastAsiaTheme="majorEastAsia" w:cstheme="minorHAnsi"/>
+          <w:color w:val="2F5496" w:themeColor="accent1" w:themeShade="BF"/>
+        </w:rPr>
+      </w:pPr>
+      <w:r>
+        <w:rPr>
+          <w:rFonts w:cstheme="minorHAnsi"/>
+        </w:rPr>
+        <w:t xml:space="preserve">Team with patrons </w:t>
+      </w:r>
+      <w:r>
+        <w:rPr>
+          <w:rFonts w:cstheme="minorHAnsi"/>
+        </w:rPr>
+        <w:t xml:space="preserve">and other </w:t>
+      </w:r>
+      <w:r>
+        <w:rPr>
+          <w:rFonts w:cstheme="minorHAnsi"/>
+        </w:rPr>
+        <w:t>leaders</w:t>
+      </w:r>
+      <w:r>
+        <w:rPr>
+          <w:rFonts w:cstheme="minorHAnsi"/>
+        </w:rPr>
+        <w:t xml:space="preserve"> </w:t>
+      </w:r>
+      <w:r>
+        <w:rPr>
+          <w:rFonts w:cstheme="minorHAnsi"/>
+        </w:rPr>
+        <w:t>to tackle vexing challenges</w:t>
+      </w:r>
+      <w:r>
+        <w:rPr>
+          <w:rFonts w:cstheme="minorHAnsi"/>
+        </w:rPr>
+        <w:t xml:space="preserve"> that can be solved with </w:t>
+      </w:r>
+      <w:r>
+        <w:rPr>
+          <w:rFonts w:cstheme="minorHAnsi"/>
+        </w:rPr>
+        <w:t xml:space="preserve">exponential solutions involving </w:t>
+      </w:r>
+      <w:r>
+        <w:rPr>
+          <w:rFonts w:cstheme="minorHAnsi"/>
+        </w:rPr>
+        <w:t>AI</w:t>
+      </w:r>
+      <w:r>
+        <w:rPr>
+          <w:rFonts w:cstheme="minorHAnsi"/>
+        </w:rPr>
+        <w:t xml:space="preserve"> and other value accelerators</w:t>
+      </w:r>
+      <w:r>
+        <w:rPr>
+          <w:rFonts w:cstheme="minorHAnsi"/>
+        </w:rPr>
+        <w:t>.</w:t>
+      </w:r>
+    </w:p>
+    <w:p>
+      <w:pPr>
+        <w:rPr>
+          <w:rFonts w:eastAsiaTheme="majorEastAsia" w:cstheme="minorHAnsi"/>
+          <w:color w:val="2F5496" w:themeColor="accent1" w:themeShade="BF"/>
+        </w:rPr>
+      </w:pPr>
+    </w:p>
+    <w:p>
+      <w:pPr>
+        <w:rPr>
+          <w:rFonts w:cstheme="minorHAnsi"/>
+        </w:rPr>
+      </w:pPr>
+    </w:p>
+    <w:p>
+      <w:pPr>
+        <w:rPr>
+          <w:rFonts w:cstheme="minorHAnsi"/>
+        </w:rPr>
+      </w:pPr>
+    </w:p>
+    <w:p>
+      <w:pPr>
+        <w:rPr>
+          <w:rFonts w:asciiTheme="majorHAnsi" w:eastAsiaTheme="majorEastAsia" w:hAnsiTheme="majorHAnsi" w:cstheme="majorBidi"/>
+          <w:color w:val="2F5496" w:themeColor="accent1" w:themeShade="BF"/>
+          <w:sz w:val="40"/>
+          <w:szCs w:val="40"/>
+        </w:rPr>
+      </w:pPr>
+      <w:r>
+        <w:br w:type="page"/>
+      </w:r>
+    </w:p>
+    <w:p>
+      <w:pPr>
+        <w:pStyle w:val="Heading1"/>
+      </w:pPr>
+    </w:p>
+    <w:p>
+      <w:pPr>
+        <w:pStyle w:val="Heading1"/>
+      </w:pPr>
+      <w:bookmarkStart w:id="8" w:name="_Toc239602756"/>
+      <w:r>
         <w:t>Outline</w:t>
       </w:r>
+      <w:bookmarkEnd w:id="8"/>
     </w:p>
     <w:p/>
     <w:p>
+      <w:r>
+        <w:br w:type="page"/>
+      </w:r>
+    </w:p>
+    <w:p/>
+    <w:p>
       <w:pPr>
         <w:pStyle w:val="Heading1"/>
       </w:pPr>
+      <w:bookmarkStart w:id="9" w:name="_Toc239602757"/>
       <w:r>
         <w:t>Draft</w:t>
       </w:r>
+      <w:bookmarkEnd w:id="9"/>
     </w:p>
     <w:sectPr>
-      <w:headerReference w:type="default" r:id="rId7"/>
+      <w:headerReference w:type="default" r:id="rId13"/>
       <w:pgSz w:w="12240" w:h="15840"/>
       <w:pgMar w:top="1440" w:right="1440" w:bottom="1440" w:left="1440" w:header="720" w:footer="720" w:gutter="0"/>
       <w:cols w:space="720"/>
@@ -110,7 +2962,7 @@
 </file>
 
 <file path=word/endnotes.xml><?xml version="1.0" encoding="utf-8"?>
-<w:endnotes xmlns:wpc="http://schemas.microsoft.com/office/word/2010/wordprocessingCanvas" xmlns:cx="http://schemas.microsoft.com/office/drawing/2014/chartex" xmlns:cx1="http://schemas.microsoft.com/office/drawing/2015/9/8/chartex" xmlns:cx2="http://schemas.microsoft.com/office/drawing/2015/10/21/chartex" xmlns:cx3="http://schemas.microsoft.com/office/drawing/2016/5/9/chartex" xmlns:cx4="http://schemas.microsoft.com/office/drawing/2016/5/10/chartex" xmlns:cx5="http://schemas.microsoft.com/office/drawing/2016/5/11/chartex" xmlns:cx6="http://schemas.microsoft.com/office/drawing/2016/5/12/chartex" xmlns:cx7="http://schemas.microsoft.com/office/drawing/2016/5/13/chartex" xmlns:cx8="http://schemas.microsoft.com/office/drawing/2016/5/14/chartex" xmlns:mc="http://schemas.openxmlformats.org/markup-compatibility/2006" xmlns:aink="http://schemas.microsoft.com/office/drawing/2016/ink" xmlns:am3d="http://schemas.microsoft.com/office/drawing/2017/model3d" xmlns:o="urn:schemas-microsoft-com:office:office" xmlns:oel="http://schemas.microsoft.com/office/2019/extlst" xmlns:r="http://schemas.openxmlformats.org/officeDocument/2006/relationships" xmlns:m="http://schemas.openxmlformats.org/officeDocument/2006/math" xmlns:v="urn:schemas-microsoft-com:vml" xmlns:wp14="http://schemas.microsoft.com/office/word/2010/wordprocessingDrawing" xmlns:wp="http://schemas.openxmlformats.org/drawingml/2006/wordprocessingDrawing" xmlns:w10="urn:schemas-microsoft-com:office:word" xmlns:w="http://schemas.openxmlformats.org/wordprocessingml/2006/main" xmlns:w14="http://schemas.microsoft.com/office/word/2010/wordml" xmlns:w15="http://schemas.microsoft.com/office/word/2012/wordml" xmlns:w16cex="http://schemas.microsoft.com/office/word/2018/wordml/cex" xmlns:w16cid="http://schemas.microsoft.com/office/word/2016/wordml/cid" xmlns:w16="http://schemas.microsoft.com/office/word/2018/wordml" xmlns:w16du="http://schemas.microsoft.com/office/word/2023/wordml/word16du" xmlns:w16sdtdh="http://schemas.microsoft.com/office/word/2020/wordml/sdtdatahash" xmlns:w16sdtfl="http://schemas.microsoft.com/office/word/2024/wordml/sdtformatlock" xmlns:w16se="http://schemas.microsoft.com/office/word/2015/wordml/symex" xmlns:wpg="http://schemas.microsoft.com/office/word/2010/wordprocessingGroup" xmlns:wpi="http://schemas.microsoft.com/office/word/2010/wordprocessingInk" xmlns:wne="http://schemas.microsoft.com/office/word/2006/wordml" xmlns:wps="http://schemas.microsoft.com/office/word/2010/wordprocessingShape" mc:Ignorable="w14 w15 w16se w16cid w16 w16cex w16sdtdh w16sdtfl w16du wp14">
+<w:endnotes xmlns:wpc="http://schemas.microsoft.com/office/word/2010/wordprocessingCanvas" xmlns:cx="http://schemas.microsoft.com/office/drawing/2014/chartex" xmlns:cx1="http://schemas.microsoft.com/office/drawing/2015/9/8/chartex" xmlns:cx2="http://schemas.microsoft.com/office/drawing/2015/10/21/chartex" xmlns:cx3="http://schemas.microsoft.com/office/drawing/2016/5/9/chartex" xmlns:cx4="http://schemas.microsoft.com/office/drawing/2016/5/10/chartex" xmlns:cx5="http://schemas.microsoft.com/office/drawing/2016/5/11/chartex" xmlns:cx6="http://schemas.microsoft.com/office/drawing/2016/5/12/chartex" xmlns:cx7="http://schemas.microsoft.com/office/drawing/2016/5/13/chartex" xmlns:cx8="http://schemas.microsoft.com/office/drawing/2016/5/14/chartex" xmlns:mc="http://schemas.openxmlformats.org/markup-compatibility/2006" xmlns:m="http://schemas.openxmlformats.org/officeDocument/2006/math" xmlns:aink="http://schemas.microsoft.com/office/drawing/2016/ink" xmlns:am3d="http://schemas.microsoft.com/office/drawing/2017/model3d" xmlns:oel="http://schemas.microsoft.com/office/2019/extlst" xmlns:r="http://schemas.openxmlformats.org/officeDocument/2006/relationships" xmlns:wp14="http://schemas.microsoft.com/office/word/2010/wordprocessingDrawing" xmlns:wp="http://schemas.openxmlformats.org/drawingml/2006/wordprocessingDrawing" xmlns:wpg="http://schemas.microsoft.com/office/word/2010/wordprocessingGroup" xmlns:wpi="http://schemas.microsoft.com/office/word/2010/wordprocessingInk" xmlns:wps="http://schemas.microsoft.com/office/word/2010/wordprocessingShape" xmlns:o="urn:schemas-microsoft-com:office:office" xmlns:v="urn:schemas-microsoft-com:vml" xmlns:w10="urn:schemas-microsoft-com:office:word" xmlns:w="http://schemas.openxmlformats.org/wordprocessingml/2006/main" xmlns:w14="http://schemas.microsoft.com/office/word/2010/wordml" xmlns:w15="http://schemas.microsoft.com/office/word/2012/wordml" xmlns:w16cex="http://schemas.microsoft.com/office/word/2018/wordml/cex" xmlns:w16cid="http://schemas.microsoft.com/office/word/2016/wordml/cid" xmlns:w16="http://schemas.microsoft.com/office/word/2018/wordml" xmlns:w16sdtdh="http://schemas.microsoft.com/office/word/2020/wordml/sdtdatahash" xmlns:w16sdtfl="http://schemas.microsoft.com/office/word/2024/wordml/sdtformatlock" xmlns:w16se="http://schemas.microsoft.com/office/word/2015/wordml/symex" xmlns:w16du="http://schemas.microsoft.com/office/word/2023/wordml/word16du" xmlns:wne="http://schemas.microsoft.com/office/word/2006/wordml" mc:Ignorable="w14 w15 w16se w16cid w16 w16cex w16sdtdh w16sdtfl w16du wp14">
   <w:endnote w:type="separator" w:id="-1">
     <w:p>
       <w:pPr>
@@ -135,7 +2987,7 @@
 </file>
 
 <file path=word/footnotes.xml><?xml version="1.0" encoding="utf-8"?>
-<w:footnotes xmlns:wpc="http://schemas.microsoft.com/office/word/2010/wordprocessingCanvas" xmlns:cx="http://schemas.microsoft.com/office/drawing/2014/chartex" xmlns:cx1="http://schemas.microsoft.com/office/drawing/2015/9/8/chartex" xmlns:cx2="http://schemas.microsoft.com/office/drawing/2015/10/21/chartex" xmlns:cx3="http://schemas.microsoft.com/office/drawing/2016/5/9/chartex" xmlns:cx4="http://schemas.microsoft.com/office/drawing/2016/5/10/chartex" xmlns:cx5="http://schemas.microsoft.com/office/drawing/2016/5/11/chartex" xmlns:cx6="http://schemas.microsoft.com/office/drawing/2016/5/12/chartex" xmlns:cx7="http://schemas.microsoft.com/office/drawing/2016/5/13/chartex" xmlns:cx8="http://schemas.microsoft.com/office/drawing/2016/5/14/chartex" xmlns:mc="http://schemas.openxmlformats.org/markup-compatibility/2006" xmlns:aink="http://schemas.microsoft.com/office/drawing/2016/ink" xmlns:am3d="http://schemas.microsoft.com/office/drawing/2017/model3d" xmlns:o="urn:schemas-microsoft-com:office:office" xmlns:oel="http://schemas.microsoft.com/office/2019/extlst" xmlns:r="http://schemas.openxmlformats.org/officeDocument/2006/relationships" xmlns:m="http://schemas.openxmlformats.org/officeDocument/2006/math" xmlns:v="urn:schemas-microsoft-com:vml" xmlns:wp14="http://schemas.microsoft.com/office/word/2010/wordprocessingDrawing" xmlns:wp="http://schemas.openxmlformats.org/drawingml/2006/wordprocessingDrawing" xmlns:w10="urn:schemas-microsoft-com:office:word" xmlns:w="http://schemas.openxmlformats.org/wordprocessingml/2006/main" xmlns:w14="http://schemas.microsoft.com/office/word/2010/wordml" xmlns:w15="http://schemas.microsoft.com/office/word/2012/wordml" xmlns:w16cex="http://schemas.microsoft.com/office/word/2018/wordml/cex" xmlns:w16cid="http://schemas.microsoft.com/office/word/2016/wordml/cid" xmlns:w16="http://schemas.microsoft.com/office/word/2018/wordml" xmlns:w16du="http://schemas.microsoft.com/office/word/2023/wordml/word16du" xmlns:w16sdtdh="http://schemas.microsoft.com/office/word/2020/wordml/sdtdatahash" xmlns:w16sdtfl="http://schemas.microsoft.com/office/word/2024/wordml/sdtformatlock" xmlns:w16se="http://schemas.microsoft.com/office/word/2015/wordml/symex" xmlns:wpg="http://schemas.microsoft.com/office/word/2010/wordprocessingGroup" xmlns:wpi="http://schemas.microsoft.com/office/word/2010/wordprocessingInk" xmlns:wne="http://schemas.microsoft.com/office/word/2006/wordml" xmlns:wps="http://schemas.microsoft.com/office/word/2010/wordprocessingShape" mc:Ignorable="w14 w15 w16se w16cid w16 w16cex w16sdtdh w16sdtfl w16du wp14">
+<w:footnotes xmlns:wpc="http://schemas.microsoft.com/office/word/2010/wordprocessingCanvas" xmlns:cx="http://schemas.microsoft.com/office/drawing/2014/chartex" xmlns:cx1="http://schemas.microsoft.com/office/drawing/2015/9/8/chartex" xmlns:cx2="http://schemas.microsoft.com/office/drawing/2015/10/21/chartex" xmlns:cx3="http://schemas.microsoft.com/office/drawing/2016/5/9/chartex" xmlns:cx4="http://schemas.microsoft.com/office/drawing/2016/5/10/chartex" xmlns:cx5="http://schemas.microsoft.com/office/drawing/2016/5/11/chartex" xmlns:cx6="http://schemas.microsoft.com/office/drawing/2016/5/12/chartex" xmlns:cx7="http://schemas.microsoft.com/office/drawing/2016/5/13/chartex" xmlns:cx8="http://schemas.microsoft.com/office/drawing/2016/5/14/chartex" xmlns:mc="http://schemas.openxmlformats.org/markup-compatibility/2006" xmlns:m="http://schemas.openxmlformats.org/officeDocument/2006/math" xmlns:aink="http://schemas.microsoft.com/office/drawing/2016/ink" xmlns:am3d="http://schemas.microsoft.com/office/drawing/2017/model3d" xmlns:oel="http://schemas.microsoft.com/office/2019/extlst" xmlns:r="http://schemas.openxmlformats.org/officeDocument/2006/relationships" xmlns:wp14="http://schemas.microsoft.com/office/word/2010/wordprocessingDrawing" xmlns:wp="http://schemas.openxmlformats.org/drawingml/2006/wordprocessingDrawing" xmlns:wpg="http://schemas.microsoft.com/office/word/2010/wordprocessingGroup" xmlns:wpi="http://schemas.microsoft.com/office/word/2010/wordprocessingInk" xmlns:wps="http://schemas.microsoft.com/office/word/2010/wordprocessingShape" xmlns:o="urn:schemas-microsoft-com:office:office" xmlns:v="urn:schemas-microsoft-com:vml" xmlns:w10="urn:schemas-microsoft-com:office:word" xmlns:w="http://schemas.openxmlformats.org/wordprocessingml/2006/main" xmlns:w14="http://schemas.microsoft.com/office/word/2010/wordml" xmlns:w15="http://schemas.microsoft.com/office/word/2012/wordml" xmlns:w16cex="http://schemas.microsoft.com/office/word/2018/wordml/cex" xmlns:w16cid="http://schemas.microsoft.com/office/word/2016/wordml/cid" xmlns:w16="http://schemas.microsoft.com/office/word/2018/wordml" xmlns:w16sdtdh="http://schemas.microsoft.com/office/word/2020/wordml/sdtdatahash" xmlns:w16sdtfl="http://schemas.microsoft.com/office/word/2024/wordml/sdtformatlock" xmlns:w16se="http://schemas.microsoft.com/office/word/2015/wordml/symex" xmlns:w16du="http://schemas.microsoft.com/office/word/2023/wordml/word16du" xmlns:wne="http://schemas.microsoft.com/office/word/2006/wordml" mc:Ignorable="w14 w15 w16se w16cid w16 w16cex w16sdtdh w16sdtfl w16du wp14">
   <w:footnote w:type="separator" w:id="-1">
     <w:p>
       <w:pPr>
@@ -160,7 +3012,7 @@
 </file>
 
 <file path=word/header1.xml><?xml version="1.0" encoding="utf-8"?>
-<w:hdr xmlns:wpc="http://schemas.microsoft.com/office/word/2010/wordprocessingCanvas" xmlns:cx="http://schemas.microsoft.com/office/drawing/2014/chartex" xmlns:cx1="http://schemas.microsoft.com/office/drawing/2015/9/8/chartex" xmlns:cx2="http://schemas.microsoft.com/office/drawing/2015/10/21/chartex" xmlns:cx3="http://schemas.microsoft.com/office/drawing/2016/5/9/chartex" xmlns:cx4="http://schemas.microsoft.com/office/drawing/2016/5/10/chartex" xmlns:cx5="http://schemas.microsoft.com/office/drawing/2016/5/11/chartex" xmlns:cx6="http://schemas.microsoft.com/office/drawing/2016/5/12/chartex" xmlns:cx7="http://schemas.microsoft.com/office/drawing/2016/5/13/chartex" xmlns:cx8="http://schemas.microsoft.com/office/drawing/2016/5/14/chartex" xmlns:mc="http://schemas.openxmlformats.org/markup-compatibility/2006" xmlns:aink="http://schemas.microsoft.com/office/drawing/2016/ink" xmlns:am3d="http://schemas.microsoft.com/office/drawing/2017/model3d" xmlns:o="urn:schemas-microsoft-com:office:office" xmlns:oel="http://schemas.microsoft.com/office/2019/extlst" xmlns:r="http://schemas.openxmlformats.org/officeDocument/2006/relationships" xmlns:m="http://schemas.openxmlformats.org/officeDocument/2006/math" xmlns:v="urn:schemas-microsoft-com:vml" xmlns:wp14="http://schemas.microsoft.com/office/word/2010/wordprocessingDrawing" xmlns:wp="http://schemas.openxmlformats.org/drawingml/2006/wordprocessingDrawing" xmlns:w10="urn:schemas-microsoft-com:office:word" xmlns:w="http://schemas.openxmlformats.org/wordprocessingml/2006/main" xmlns:w14="http://schemas.microsoft.com/office/word/2010/wordml" xmlns:w15="http://schemas.microsoft.com/office/word/2012/wordml" xmlns:w16cex="http://schemas.microsoft.com/office/word/2018/wordml/cex" xmlns:w16cid="http://schemas.microsoft.com/office/word/2016/wordml/cid" xmlns:w16="http://schemas.microsoft.com/office/word/2018/wordml" xmlns:w16du="http://schemas.microsoft.com/office/word/2023/wordml/word16du" xmlns:w16sdtdh="http://schemas.microsoft.com/office/word/2020/wordml/sdtdatahash" xmlns:w16sdtfl="http://schemas.microsoft.com/office/word/2024/wordml/sdtformatlock" xmlns:w16se="http://schemas.microsoft.com/office/word/2015/wordml/symex" xmlns:wpg="http://schemas.microsoft.com/office/word/2010/wordprocessingGroup" xmlns:wpi="http://schemas.microsoft.com/office/word/2010/wordprocessingInk" xmlns:wne="http://schemas.microsoft.com/office/word/2006/wordml" xmlns:wps="http://schemas.microsoft.com/office/word/2010/wordprocessingShape" mc:Ignorable="w14 w15 w16se w16cid w16 w16cex w16sdtdh w16sdtfl w16du wp14">
+<w:hdr xmlns:wpc="http://schemas.microsoft.com/office/word/2010/wordprocessingCanvas" xmlns:cx="http://schemas.microsoft.com/office/drawing/2014/chartex" xmlns:cx1="http://schemas.microsoft.com/office/drawing/2015/9/8/chartex" xmlns:cx2="http://schemas.microsoft.com/office/drawing/2015/10/21/chartex" xmlns:cx3="http://schemas.microsoft.com/office/drawing/2016/5/9/chartex" xmlns:cx4="http://schemas.microsoft.com/office/drawing/2016/5/10/chartex" xmlns:cx5="http://schemas.microsoft.com/office/drawing/2016/5/11/chartex" xmlns:cx6="http://schemas.microsoft.com/office/drawing/2016/5/12/chartex" xmlns:cx7="http://schemas.microsoft.com/office/drawing/2016/5/13/chartex" xmlns:cx8="http://schemas.microsoft.com/office/drawing/2016/5/14/chartex" xmlns:mc="http://schemas.openxmlformats.org/markup-compatibility/2006" xmlns:m="http://schemas.openxmlformats.org/officeDocument/2006/math" xmlns:aink="http://schemas.microsoft.com/office/drawing/2016/ink" xmlns:am3d="http://schemas.microsoft.com/office/drawing/2017/model3d" xmlns:oel="http://schemas.microsoft.com/office/2019/extlst" xmlns:r="http://schemas.openxmlformats.org/officeDocument/2006/relationships" xmlns:wp14="http://schemas.microsoft.com/office/word/2010/wordprocessingDrawing" xmlns:wp="http://schemas.openxmlformats.org/drawingml/2006/wordprocessingDrawing" xmlns:wpg="http://schemas.microsoft.com/office/word/2010/wordprocessingGroup" xmlns:wpi="http://schemas.microsoft.com/office/word/2010/wordprocessingInk" xmlns:wps="http://schemas.microsoft.com/office/word/2010/wordprocessingShape" xmlns:o="urn:schemas-microsoft-com:office:office" xmlns:v="urn:schemas-microsoft-com:vml" xmlns:w10="urn:schemas-microsoft-com:office:word" xmlns:w="http://schemas.openxmlformats.org/wordprocessingml/2006/main" xmlns:w14="http://schemas.microsoft.com/office/word/2010/wordml" xmlns:w15="http://schemas.microsoft.com/office/word/2012/wordml" xmlns:w16cex="http://schemas.microsoft.com/office/word/2018/wordml/cex" xmlns:w16cid="http://schemas.microsoft.com/office/word/2016/wordml/cid" xmlns:w16="http://schemas.microsoft.com/office/word/2018/wordml" xmlns:w16sdtdh="http://schemas.microsoft.com/office/word/2020/wordml/sdtdatahash" xmlns:w16sdtfl="http://schemas.microsoft.com/office/word/2024/wordml/sdtformatlock" xmlns:w16se="http://schemas.microsoft.com/office/word/2015/wordml/symex" xmlns:w16du="http://schemas.microsoft.com/office/word/2023/wordml/word16du" xmlns:wne="http://schemas.microsoft.com/office/word/2006/wordml" mc:Ignorable="w14 w15 w16se w16cid w16 w16cex w16sdtdh w16sdtfl w16du wp14">
   <w:p>
     <w:pPr>
       <w:pStyle w:val="Title"/>
@@ -180,8 +3032,128 @@
 </w:hdr>
 </file>
 
+<file path=word/numbering.xml><?xml version="1.0" encoding="utf-8"?>
+<w:numbering xmlns:wpc="http://schemas.microsoft.com/office/word/2010/wordprocessingCanvas" xmlns:cx="http://schemas.microsoft.com/office/drawing/2014/chartex" xmlns:cx1="http://schemas.microsoft.com/office/drawing/2015/9/8/chartex" xmlns:cx2="http://schemas.microsoft.com/office/drawing/2015/10/21/chartex" xmlns:cx3="http://schemas.microsoft.com/office/drawing/2016/5/9/chartex" xmlns:cx4="http://schemas.microsoft.com/office/drawing/2016/5/10/chartex" xmlns:cx5="http://schemas.microsoft.com/office/drawing/2016/5/11/chartex" xmlns:cx6="http://schemas.microsoft.com/office/drawing/2016/5/12/chartex" xmlns:cx7="http://schemas.microsoft.com/office/drawing/2016/5/13/chartex" xmlns:cx8="http://schemas.microsoft.com/office/drawing/2016/5/14/chartex" xmlns:mc="http://schemas.openxmlformats.org/markup-compatibility/2006" xmlns:m="http://schemas.openxmlformats.org/officeDocument/2006/math" xmlns:aink="http://schemas.microsoft.com/office/drawing/2016/ink" xmlns:am3d="http://schemas.microsoft.com/office/drawing/2017/model3d" xmlns:oel="http://schemas.microsoft.com/office/2019/extlst" xmlns:r="http://schemas.openxmlformats.org/officeDocument/2006/relationships" xmlns:wp14="http://schemas.microsoft.com/office/word/2010/wordprocessingDrawing" xmlns:wp="http://schemas.openxmlformats.org/drawingml/2006/wordprocessingDrawing" xmlns:wpg="http://schemas.microsoft.com/office/word/2010/wordprocessingGroup" xmlns:wpi="http://schemas.microsoft.com/office/word/2010/wordprocessingInk" xmlns:wps="http://schemas.microsoft.com/office/word/2010/wordprocessingShape" xmlns:o="urn:schemas-microsoft-com:office:office" xmlns:v="urn:schemas-microsoft-com:vml" xmlns:w10="urn:schemas-microsoft-com:office:word" xmlns:w="http://schemas.openxmlformats.org/wordprocessingml/2006/main" xmlns:w14="http://schemas.microsoft.com/office/word/2010/wordml" xmlns:w15="http://schemas.microsoft.com/office/word/2012/wordml" xmlns:w16cex="http://schemas.microsoft.com/office/word/2018/wordml/cex" xmlns:w16cid="http://schemas.microsoft.com/office/word/2016/wordml/cid" xmlns:w16="http://schemas.microsoft.com/office/word/2018/wordml" xmlns:w16sdtdh="http://schemas.microsoft.com/office/word/2020/wordml/sdtdatahash" xmlns:w16sdtfl="http://schemas.microsoft.com/office/word/2024/wordml/sdtformatlock" xmlns:w16se="http://schemas.microsoft.com/office/word/2015/wordml/symex" xmlns:w16du="http://schemas.microsoft.com/office/word/2023/wordml/word16du" xmlns:wne="http://schemas.microsoft.com/office/word/2006/wordml" mc:Ignorable="w14 w15 w16se w16cid w16 w16cex w16sdtdh w16sdtfl w16du wp14">
+  <w:abstractNum w:abstractNumId="0" w15:restartNumberingAfterBreak="0">
+    <w:nsid w:val="07305C91"/>
+    <w:multiLevelType w:val="hybridMultilevel"/>
+    <w:tmpl w:val="62D4FEF4"/>
+    <w:lvl w:ilvl="0" w:tplc="9AD2FAA8">
+      <w:numFmt w:val="bullet"/>
+      <w:lvlText w:val="-"/>
+      <w:lvlJc w:val="left"/>
+      <w:pPr>
+        <w:ind w:left="720" w:hanging="360"/>
+      </w:pPr>
+      <w:rPr>
+        <w:rFonts w:ascii="Calibri" w:eastAsiaTheme="minorHAnsi" w:hAnsi="Calibri" w:cs="Calibri" w:hint="default"/>
+      </w:rPr>
+    </w:lvl>
+    <w:lvl w:ilvl="1" w:tplc="04090003">
+      <w:start w:val="1"/>
+      <w:numFmt w:val="bullet"/>
+      <w:lvlText w:val="o"/>
+      <w:lvlJc w:val="left"/>
+      <w:pPr>
+        <w:ind w:left="1440" w:hanging="360"/>
+      </w:pPr>
+      <w:rPr>
+        <w:rFonts w:ascii="Courier New" w:hAnsi="Courier New" w:cs="Courier New" w:hint="default"/>
+      </w:rPr>
+    </w:lvl>
+    <w:lvl w:ilvl="2" w:tplc="04090005">
+      <w:start w:val="1"/>
+      <w:numFmt w:val="bullet"/>
+      <w:lvlText w:val=""/>
+      <w:lvlJc w:val="left"/>
+      <w:pPr>
+        <w:ind w:left="2160" w:hanging="360"/>
+      </w:pPr>
+      <w:rPr>
+        <w:rFonts w:ascii="Wingdings" w:hAnsi="Wingdings" w:hint="default"/>
+      </w:rPr>
+    </w:lvl>
+    <w:lvl w:ilvl="3" w:tplc="04090001" w:tentative="1">
+      <w:start w:val="1"/>
+      <w:numFmt w:val="bullet"/>
+      <w:lvlText w:val=""/>
+      <w:lvlJc w:val="left"/>
+      <w:pPr>
+        <w:ind w:left="2880" w:hanging="360"/>
+      </w:pPr>
+      <w:rPr>
+        <w:rFonts w:ascii="Symbol" w:hAnsi="Symbol" w:hint="default"/>
+      </w:rPr>
+    </w:lvl>
+    <w:lvl w:ilvl="4" w:tplc="04090003" w:tentative="1">
+      <w:start w:val="1"/>
+      <w:numFmt w:val="bullet"/>
+      <w:lvlText w:val="o"/>
+      <w:lvlJc w:val="left"/>
+      <w:pPr>
+        <w:ind w:left="3600" w:hanging="360"/>
+      </w:pPr>
+      <w:rPr>
+        <w:rFonts w:ascii="Courier New" w:hAnsi="Courier New" w:cs="Courier New" w:hint="default"/>
+      </w:rPr>
+    </w:lvl>
+    <w:lvl w:ilvl="5" w:tplc="04090005" w:tentative="1">
+      <w:start w:val="1"/>
+      <w:numFmt w:val="bullet"/>
+      <w:lvlText w:val=""/>
+      <w:lvlJc w:val="left"/>
+      <w:pPr>
+        <w:ind w:left="4320" w:hanging="360"/>
+      </w:pPr>
+      <w:rPr>
+        <w:rFonts w:ascii="Wingdings" w:hAnsi="Wingdings" w:hint="default"/>
+      </w:rPr>
+    </w:lvl>
+    <w:lvl w:ilvl="6" w:tplc="04090001" w:tentative="1">
+      <w:start w:val="1"/>
+      <w:numFmt w:val="bullet"/>
+      <w:lvlText w:val=""/>
+      <w:lvlJc w:val="left"/>
+      <w:pPr>
+        <w:ind w:left="5040" w:hanging="360"/>
+      </w:pPr>
+      <w:rPr>
+        <w:rFonts w:ascii="Symbol" w:hAnsi="Symbol" w:hint="default"/>
+      </w:rPr>
+    </w:lvl>
+    <w:lvl w:ilvl="7" w:tplc="04090003" w:tentative="1">
+      <w:start w:val="1"/>
+      <w:numFmt w:val="bullet"/>
+      <w:lvlText w:val="o"/>
+      <w:lvlJc w:val="left"/>
+      <w:pPr>
+        <w:ind w:left="5760" w:hanging="360"/>
+      </w:pPr>
+      <w:rPr>
+        <w:rFonts w:ascii="Courier New" w:hAnsi="Courier New" w:cs="Courier New" w:hint="default"/>
+      </w:rPr>
+    </w:lvl>
+    <w:lvl w:ilvl="8" w:tplc="04090005" w:tentative="1">
+      <w:start w:val="1"/>
+      <w:numFmt w:val="bullet"/>
+      <w:lvlText w:val=""/>
+      <w:lvlJc w:val="left"/>
+      <w:pPr>
+        <w:ind w:left="6480" w:hanging="360"/>
+      </w:pPr>
+      <w:rPr>
+        <w:rFonts w:ascii="Wingdings" w:hAnsi="Wingdings" w:hint="default"/>
+      </w:rPr>
+    </w:lvl>
+  </w:abstractNum>
+  <w:num w:numId="1" w16cid:durableId="544953895">
+    <w:abstractNumId w:val="0"/>
+  </w:num>
+</w:numbering>
+</file>
+
 <file path=word/styles.xml><?xml version="1.0" encoding="utf-8"?>
-<w:styles xmlns:mc="http://schemas.openxmlformats.org/markup-compatibility/2006" xmlns:r="http://schemas.openxmlformats.org/officeDocument/2006/relationships" xmlns:w="http://schemas.openxmlformats.org/wordprocessingml/2006/main" xmlns:w14="http://schemas.microsoft.com/office/word/2010/wordml" xmlns:w15="http://schemas.microsoft.com/office/word/2012/wordml" xmlns:w16cex="http://schemas.microsoft.com/office/word/2018/wordml/cex" xmlns:w16cid="http://schemas.microsoft.com/office/word/2016/wordml/cid" xmlns:w16="http://schemas.microsoft.com/office/word/2018/wordml" xmlns:w16du="http://schemas.microsoft.com/office/word/2023/wordml/word16du" xmlns:w16sdtdh="http://schemas.microsoft.com/office/word/2020/wordml/sdtdatahash" xmlns:w16sdtfl="http://schemas.microsoft.com/office/word/2024/wordml/sdtformatlock" xmlns:w16se="http://schemas.microsoft.com/office/word/2015/wordml/symex" mc:Ignorable="w14 w15 w16se w16cid w16 w16cex w16sdtdh w16sdtfl w16du">
+<w:styles xmlns:mc="http://schemas.openxmlformats.org/markup-compatibility/2006" xmlns:r="http://schemas.openxmlformats.org/officeDocument/2006/relationships" xmlns:w="http://schemas.openxmlformats.org/wordprocessingml/2006/main" xmlns:w14="http://schemas.microsoft.com/office/word/2010/wordml" xmlns:w15="http://schemas.microsoft.com/office/word/2012/wordml" xmlns:w16cex="http://schemas.microsoft.com/office/word/2018/wordml/cex" xmlns:w16cid="http://schemas.microsoft.com/office/word/2016/wordml/cid" xmlns:w16="http://schemas.microsoft.com/office/word/2018/wordml" xmlns:w16sdtdh="http://schemas.microsoft.com/office/word/2020/wordml/sdtdatahash" xmlns:w16sdtfl="http://schemas.microsoft.com/office/word/2024/wordml/sdtformatlock" xmlns:w16se="http://schemas.microsoft.com/office/word/2015/wordml/symex" xmlns:w16du="http://schemas.microsoft.com/office/word/2023/wordml/word16du" mc:Ignorable="w14 w15 w16se w16cid w16 w16cex w16sdtdh w16sdtfl w16du">
   <w:docDefaults>
     <w:rPrDefault>
       <w:rPr>
@@ -608,7 +3580,6 @@
     <w:next w:val="Normal"/>
     <w:link w:val="Heading2Char"/>
     <w:uiPriority w:val="9"/>
-    <w:semiHidden/>
     <w:unhideWhenUsed/>
     <w:qFormat/>
     <w:rsid w:val="00FE520E"/>
@@ -825,7 +3796,6 @@
     <w:basedOn w:val="DefaultParagraphFont"/>
     <w:link w:val="Heading2"/>
     <w:uiPriority w:val="9"/>
-    <w:semiHidden/>
     <w:rsid w:val="00FE520E"/>
     <w:rPr>
       <w:rFonts w:asciiTheme="majorHAnsi" w:eastAsiaTheme="majorEastAsia" w:hAnsiTheme="majorHAnsi" w:cstheme="majorBidi"/>
@@ -1140,6 +4110,347 @@
     <w:link w:val="Footer"/>
     <w:uiPriority w:val="99"/>
     <w:rsid w:val="00FE520E"/>
+  </w:style>
+  <w:style w:type="character" w:styleId="Hyperlink">
+    <w:name w:val="Hyperlink"/>
+    <w:basedOn w:val="DefaultParagraphFont"/>
+    <w:uiPriority w:val="99"/>
+    <w:unhideWhenUsed/>
+    <w:rsid w:val="00BA4943"/>
+    <w:rPr>
+      <w:color w:val="0563C1" w:themeColor="hyperlink"/>
+      <w:u w:val="single"/>
+    </w:rPr>
+  </w:style>
+  <w:style w:type="character" w:styleId="UnresolvedMention">
+    <w:name w:val="Unresolved Mention"/>
+    <w:basedOn w:val="DefaultParagraphFont"/>
+    <w:uiPriority w:val="99"/>
+    <w:semiHidden/>
+    <w:unhideWhenUsed/>
+    <w:rsid w:val="00BA4943"/>
+    <w:rPr>
+      <w:color w:val="605E5C"/>
+      <w:shd w:val="clear" w:color="auto" w:fill="E1DFDD"/>
+    </w:rPr>
+  </w:style>
+  <w:style w:type="paragraph" w:styleId="TOCHeading">
+    <w:name w:val="TOC Heading"/>
+    <w:basedOn w:val="Heading1"/>
+    <w:next w:val="Normal"/>
+    <w:uiPriority w:val="39"/>
+    <w:unhideWhenUsed/>
+    <w:qFormat/>
+    <w:rsid w:val="00230CAF"/>
+    <w:pPr>
+      <w:spacing w:before="480" w:after="0" w:line="276" w:lineRule="auto"/>
+      <w:outlineLvl w:val="9"/>
+    </w:pPr>
+    <w:rPr>
+      <w:b/>
+      <w:bCs/>
+      <w:kern w:val="0"/>
+      <w:sz w:val="28"/>
+      <w:szCs w:val="28"/>
+      <w14:ligatures w14:val="none"/>
+    </w:rPr>
+  </w:style>
+  <w:style w:type="paragraph" w:styleId="TOC1">
+    <w:name w:val="toc 1"/>
+    <w:basedOn w:val="Normal"/>
+    <w:next w:val="Normal"/>
+    <w:autoRedefine/>
+    <w:uiPriority w:val="39"/>
+    <w:unhideWhenUsed/>
+    <w:rsid w:val="00230CAF"/>
+    <w:pPr>
+      <w:spacing w:before="120" w:after="0"/>
+    </w:pPr>
+    <w:rPr>
+      <w:rFonts w:cstheme="minorHAnsi"/>
+      <w:b/>
+      <w:bCs/>
+      <w:i/>
+      <w:iCs/>
+    </w:rPr>
+  </w:style>
+  <w:style w:type="paragraph" w:styleId="TOC2">
+    <w:name w:val="toc 2"/>
+    <w:basedOn w:val="Normal"/>
+    <w:next w:val="Normal"/>
+    <w:autoRedefine/>
+    <w:uiPriority w:val="39"/>
+    <w:unhideWhenUsed/>
+    <w:rsid w:val="00230CAF"/>
+    <w:pPr>
+      <w:spacing w:before="120" w:after="0"/>
+      <w:ind w:left="240"/>
+    </w:pPr>
+    <w:rPr>
+      <w:rFonts w:cstheme="minorHAnsi"/>
+      <w:b/>
+      <w:bCs/>
+      <w:sz w:val="22"/>
+      <w:szCs w:val="22"/>
+    </w:rPr>
+  </w:style>
+  <w:style w:type="paragraph" w:styleId="TOC3">
+    <w:name w:val="toc 3"/>
+    <w:basedOn w:val="Normal"/>
+    <w:next w:val="Normal"/>
+    <w:autoRedefine/>
+    <w:uiPriority w:val="39"/>
+    <w:semiHidden/>
+    <w:unhideWhenUsed/>
+    <w:rsid w:val="00230CAF"/>
+    <w:pPr>
+      <w:spacing w:after="0"/>
+      <w:ind w:left="480"/>
+    </w:pPr>
+    <w:rPr>
+      <w:rFonts w:cstheme="minorHAnsi"/>
+      <w:sz w:val="20"/>
+      <w:szCs w:val="20"/>
+    </w:rPr>
+  </w:style>
+  <w:style w:type="paragraph" w:styleId="TOC4">
+    <w:name w:val="toc 4"/>
+    <w:basedOn w:val="Normal"/>
+    <w:next w:val="Normal"/>
+    <w:autoRedefine/>
+    <w:uiPriority w:val="39"/>
+    <w:semiHidden/>
+    <w:unhideWhenUsed/>
+    <w:rsid w:val="00230CAF"/>
+    <w:pPr>
+      <w:spacing w:after="0"/>
+      <w:ind w:left="720"/>
+    </w:pPr>
+    <w:rPr>
+      <w:rFonts w:cstheme="minorHAnsi"/>
+      <w:sz w:val="20"/>
+      <w:szCs w:val="20"/>
+    </w:rPr>
+  </w:style>
+  <w:style w:type="paragraph" w:styleId="TOC5">
+    <w:name w:val="toc 5"/>
+    <w:basedOn w:val="Normal"/>
+    <w:next w:val="Normal"/>
+    <w:autoRedefine/>
+    <w:uiPriority w:val="39"/>
+    <w:semiHidden/>
+    <w:unhideWhenUsed/>
+    <w:rsid w:val="00230CAF"/>
+    <w:pPr>
+      <w:spacing w:after="0"/>
+      <w:ind w:left="960"/>
+    </w:pPr>
+    <w:rPr>
+      <w:rFonts w:cstheme="minorHAnsi"/>
+      <w:sz w:val="20"/>
+      <w:szCs w:val="20"/>
+    </w:rPr>
+  </w:style>
+  <w:style w:type="paragraph" w:styleId="TOC6">
+    <w:name w:val="toc 6"/>
+    <w:basedOn w:val="Normal"/>
+    <w:next w:val="Normal"/>
+    <w:autoRedefine/>
+    <w:uiPriority w:val="39"/>
+    <w:semiHidden/>
+    <w:unhideWhenUsed/>
+    <w:rsid w:val="00230CAF"/>
+    <w:pPr>
+      <w:spacing w:after="0"/>
+      <w:ind w:left="1200"/>
+    </w:pPr>
+    <w:rPr>
+      <w:rFonts w:cstheme="minorHAnsi"/>
+      <w:sz w:val="20"/>
+      <w:szCs w:val="20"/>
+    </w:rPr>
+  </w:style>
+  <w:style w:type="paragraph" w:styleId="TOC7">
+    <w:name w:val="toc 7"/>
+    <w:basedOn w:val="Normal"/>
+    <w:next w:val="Normal"/>
+    <w:autoRedefine/>
+    <w:uiPriority w:val="39"/>
+    <w:semiHidden/>
+    <w:unhideWhenUsed/>
+    <w:rsid w:val="00230CAF"/>
+    <w:pPr>
+      <w:spacing w:after="0"/>
+      <w:ind w:left="1440"/>
+    </w:pPr>
+    <w:rPr>
+      <w:rFonts w:cstheme="minorHAnsi"/>
+      <w:sz w:val="20"/>
+      <w:szCs w:val="20"/>
+    </w:rPr>
+  </w:style>
+  <w:style w:type="paragraph" w:styleId="TOC8">
+    <w:name w:val="toc 8"/>
+    <w:basedOn w:val="Normal"/>
+    <w:next w:val="Normal"/>
+    <w:autoRedefine/>
+    <w:uiPriority w:val="39"/>
+    <w:semiHidden/>
+    <w:unhideWhenUsed/>
+    <w:rsid w:val="00230CAF"/>
+    <w:pPr>
+      <w:spacing w:after="0"/>
+      <w:ind w:left="1680"/>
+    </w:pPr>
+    <w:rPr>
+      <w:rFonts w:cstheme="minorHAnsi"/>
+      <w:sz w:val="20"/>
+      <w:szCs w:val="20"/>
+    </w:rPr>
+  </w:style>
+  <w:style w:type="paragraph" w:styleId="TOC9">
+    <w:name w:val="toc 9"/>
+    <w:basedOn w:val="Normal"/>
+    <w:next w:val="Normal"/>
+    <w:autoRedefine/>
+    <w:uiPriority w:val="39"/>
+    <w:semiHidden/>
+    <w:unhideWhenUsed/>
+    <w:rsid w:val="00230CAF"/>
+    <w:pPr>
+      <w:spacing w:after="0"/>
+      <w:ind w:left="1920"/>
+    </w:pPr>
+    <w:rPr>
+      <w:rFonts w:cstheme="minorHAnsi"/>
+      <w:sz w:val="20"/>
+      <w:szCs w:val="20"/>
+    </w:rPr>
+  </w:style>
+  <w:style w:type="table" w:styleId="TableGrid">
+    <w:name w:val="Table Grid"/>
+    <w:basedOn w:val="TableNormal"/>
+    <w:uiPriority w:val="39"/>
+    <w:rsid w:val="00880DF2"/>
+    <w:pPr>
+      <w:spacing w:after="0" w:line="240" w:lineRule="auto"/>
+    </w:pPr>
+    <w:tblPr>
+      <w:tblBorders>
+        <w:top w:val="single" w:sz="4" w:space="0" w:color="auto"/>
+        <w:left w:val="single" w:sz="4" w:space="0" w:color="auto"/>
+        <w:bottom w:val="single" w:sz="4" w:space="0" w:color="auto"/>
+        <w:right w:val="single" w:sz="4" w:space="0" w:color="auto"/>
+        <w:insideH w:val="single" w:sz="4" w:space="0" w:color="auto"/>
+        <w:insideV w:val="single" w:sz="4" w:space="0" w:color="auto"/>
+      </w:tblBorders>
+    </w:tblPr>
+  </w:style>
+  <w:style w:type="table" w:styleId="GridTable5Dark-Accent6">
+    <w:name w:val="Grid Table 5 Dark Accent 6"/>
+    <w:basedOn w:val="TableNormal"/>
+    <w:uiPriority w:val="50"/>
+    <w:rsid w:val="00C32C85"/>
+    <w:pPr>
+      <w:spacing w:after="0" w:line="240" w:lineRule="auto"/>
+    </w:pPr>
+    <w:tblPr>
+      <w:tblStyleRowBandSize w:val="1"/>
+      <w:tblStyleColBandSize w:val="1"/>
+      <w:tblBorders>
+        <w:top w:val="single" w:sz="4" w:space="0" w:color="FFFFFF" w:themeColor="background1"/>
+        <w:left w:val="single" w:sz="4" w:space="0" w:color="FFFFFF" w:themeColor="background1"/>
+        <w:bottom w:val="single" w:sz="4" w:space="0" w:color="FFFFFF" w:themeColor="background1"/>
+        <w:right w:val="single" w:sz="4" w:space="0" w:color="FFFFFF" w:themeColor="background1"/>
+        <w:insideH w:val="single" w:sz="4" w:space="0" w:color="FFFFFF" w:themeColor="background1"/>
+        <w:insideV w:val="single" w:sz="4" w:space="0" w:color="FFFFFF" w:themeColor="background1"/>
+      </w:tblBorders>
+    </w:tblPr>
+    <w:tcPr>
+      <w:shd w:val="clear" w:color="auto" w:fill="E2EFD9" w:themeFill="accent6" w:themeFillTint="33"/>
+    </w:tcPr>
+    <w:tblStylePr w:type="firstRow">
+      <w:rPr>
+        <w:b/>
+        <w:bCs/>
+        <w:color w:val="FFFFFF" w:themeColor="background1"/>
+      </w:rPr>
+      <w:tblPr/>
+      <w:tcPr>
+        <w:tcBorders>
+          <w:top w:val="single" w:sz="4" w:space="0" w:color="FFFFFF" w:themeColor="background1"/>
+          <w:left w:val="single" w:sz="4" w:space="0" w:color="FFFFFF" w:themeColor="background1"/>
+          <w:right w:val="single" w:sz="4" w:space="0" w:color="FFFFFF" w:themeColor="background1"/>
+          <w:insideH w:val="nil"/>
+          <w:insideV w:val="nil"/>
+        </w:tcBorders>
+        <w:shd w:val="clear" w:color="auto" w:fill="70AD47" w:themeFill="accent6"/>
+      </w:tcPr>
+    </w:tblStylePr>
+    <w:tblStylePr w:type="lastRow">
+      <w:rPr>
+        <w:b/>
+        <w:bCs/>
+        <w:color w:val="FFFFFF" w:themeColor="background1"/>
+      </w:rPr>
+      <w:tblPr/>
+      <w:tcPr>
+        <w:tcBorders>
+          <w:left w:val="single" w:sz="4" w:space="0" w:color="FFFFFF" w:themeColor="background1"/>
+          <w:bottom w:val="single" w:sz="4" w:space="0" w:color="FFFFFF" w:themeColor="background1"/>
+          <w:right w:val="single" w:sz="4" w:space="0" w:color="FFFFFF" w:themeColor="background1"/>
+          <w:insideH w:val="nil"/>
+          <w:insideV w:val="nil"/>
+        </w:tcBorders>
+        <w:shd w:val="clear" w:color="auto" w:fill="70AD47" w:themeFill="accent6"/>
+      </w:tcPr>
+    </w:tblStylePr>
+    <w:tblStylePr w:type="firstCol">
+      <w:rPr>
+        <w:b/>
+        <w:bCs/>
+        <w:color w:val="FFFFFF" w:themeColor="background1"/>
+      </w:rPr>
+      <w:tblPr/>
+      <w:tcPr>
+        <w:tcBorders>
+          <w:top w:val="single" w:sz="4" w:space="0" w:color="FFFFFF" w:themeColor="background1"/>
+          <w:left w:val="single" w:sz="4" w:space="0" w:color="FFFFFF" w:themeColor="background1"/>
+          <w:bottom w:val="single" w:sz="4" w:space="0" w:color="FFFFFF" w:themeColor="background1"/>
+          <w:insideV w:val="nil"/>
+        </w:tcBorders>
+        <w:shd w:val="clear" w:color="auto" w:fill="70AD47" w:themeFill="accent6"/>
+      </w:tcPr>
+    </w:tblStylePr>
+    <w:tblStylePr w:type="lastCol">
+      <w:rPr>
+        <w:b/>
+        <w:bCs/>
+        <w:color w:val="FFFFFF" w:themeColor="background1"/>
+      </w:rPr>
+      <w:tblPr/>
+      <w:tcPr>
+        <w:tcBorders>
+          <w:top w:val="single" w:sz="4" w:space="0" w:color="FFFFFF" w:themeColor="background1"/>
+          <w:bottom w:val="single" w:sz="4" w:space="0" w:color="FFFFFF" w:themeColor="background1"/>
+          <w:right w:val="single" w:sz="4" w:space="0" w:color="FFFFFF" w:themeColor="background1"/>
+          <w:insideV w:val="nil"/>
+        </w:tcBorders>
+        <w:shd w:val="clear" w:color="auto" w:fill="70AD47" w:themeFill="accent6"/>
+      </w:tcPr>
+    </w:tblStylePr>
+    <w:tblStylePr w:type="band1Vert">
+      <w:tblPr/>
+      <w:tcPr>
+        <w:shd w:val="clear" w:color="auto" w:fill="C5E0B3" w:themeFill="accent6" w:themeFillTint="66"/>
+      </w:tcPr>
+    </w:tblStylePr>
+    <w:tblStylePr w:type="band1Horz">
+      <w:tblPr/>
+      <w:tcPr>
+        <w:shd w:val="clear" w:color="auto" w:fill="C5E0B3" w:themeFill="accent6" w:themeFillTint="66"/>
+      </w:tcPr>
+    </w:tblStylePr>
   </w:style>
 </w:styles>
 </file>
@@ -1437,4 +4748,16 @@
     </a:ext>
   </a:extLst>
 </a:theme>
+</file>
+
+<file path=customXml/item1.xml><?xml version="1.0" encoding="utf-8"?>
+<b:Sources xmlns:b="http://schemas.openxmlformats.org/officeDocument/2006/bibliography" xmlns="http://schemas.openxmlformats.org/officeDocument/2006/bibliography" SelectedStyle="/APASixthEditionOfficeOnline.xsl" StyleName="APA" Version="6"/>
+</file>
+
+<file path=customXml/itemProps1.xml><?xml version="1.0" encoding="utf-8"?>
+<ds:datastoreItem xmlns:ds="http://schemas.openxmlformats.org/officeDocument/2006/customXml" ds:itemID="{9053E582-6611-7A42-9EF4-1955D15BE913}">
+  <ds:schemaRefs>
+    <ds:schemaRef ds:uri="http://schemas.openxmlformats.org/officeDocument/2006/bibliography"/>
+  </ds:schemaRefs>
+</ds:datastoreItem>
 </file>
</xml_diff>